<commit_message>
Projeto reformulado: acrescenta questionário (Apêndice A) e roteiro de entrevista (Apêndice B) na perspectiva da encenação da PNED
Co-Authored-By: Claude Opus 5.5 <noreply@anthropic.com>
Claude-Session: https://claude.ai/code/session_01HxStpW4pQoDfJdTDYr6zEC
</commit_message>
<xml_diff>
--- a/projeto_reformulado/PROJETO_TESE_ENCENACAO_PNED.docx
+++ b/projeto_reformulado/PROJETO_TESE_ENCENACAO_PNED.docx
@@ -592,7 +592,7 @@
         <w:jc w:val="both"/>
       </w:pPr>
       <w:r>
-        <w:t>A produção de dados se apoia na triangulação de três instrumentos. A análise documental examina a Lei nº 14.533/2023 em contraste com os documentos institucionais da escola, como o Projeto Político-Pedagógico e os planejamentos, observando como a linguagem oficial é absorvida ou tensionada no papel. O questionário de perfil e percepções delineia o perfil socioeconômico e profissional da equipe, as condições materiais de trabalho e as formas preliminares pelas quais esses sujeitos habitam o digital. As entrevistas semiestruturadas em profundidade, instrumento central, serão conduzidas como narrativas, para escutar como os profissionais decodificam os textos da política (interpretação), que táticas utilizam no cotidiano (tradução) e como respondem às cobranças (performatividade e resistências). O registro iconográfico e o acervo do Museu Digital de Pipa, já reunidos, sustentam a caracterização do território e das condições materiais da escola.</w:t>
+        <w:t>A produção de dados se apoia na triangulação de três instrumentos. A análise documental examina a Lei nº 14.533/2023 em contraste com os documentos institucionais da escola, como o Projeto Político-Pedagógico e os planejamentos, observando como a linguagem oficial é absorvida ou tensionada no papel. O questionário de perfil e percepções (Apêndice A) delineia o perfil socioeconômico e profissional da equipe, as condições materiais de trabalho e as formas preliminares pelas quais esses sujeitos habitam o digital. As entrevistas semiestruturadas em profundidade (Apêndice B), instrumento central, serão conduzidas como narrativas, para escutar como os profissionais decodificam os textos da política (interpretação), que táticas utilizam no cotidiano (tradução) e como respondem às cobranças (performatividade e resistências). O registro iconográfico e o acervo do Museu Digital de Pipa, já reunidos, sustentam a caracterização do território e das condições materiais da escola.</w:t>
       </w:r>
     </w:p>
     <w:p>
@@ -878,6 +878,3364 @@
       </w:pPr>
       <w:r>
         <w:t>ZUBOFF, Shoshana. A era do capitalismo de vigilância: a luta por um futuro humano na nova fronteira do poder. Rio de Janeiro: Intrínseca, 2021.</w:t>
+      </w:r>
+    </w:p>
+    <w:p>
+      <w:r>
+        <w:br w:type="page"/>
+      </w:r>
+    </w:p>
+    <w:p>
+      <w:pPr>
+        <w:spacing w:after="240"/>
+        <w:jc w:val="center"/>
+      </w:pPr>
+      <w:r>
+        <w:rPr>
+          <w:b/>
+        </w:rPr>
+        <w:t>APÊNDICE A – QUESTIONÁRIO DE PERFIL E PERCEPÇÕES SOBRE A PNED</w:t>
+      </w:r>
+    </w:p>
+    <w:p>
+      <w:pPr>
+        <w:spacing w:after="120"/>
+        <w:jc w:val="both"/>
+      </w:pPr>
+      <w:r>
+        <w:rPr>
+          <w:b/>
+        </w:rPr>
+        <w:t xml:space="preserve">Pesquisa: </w:t>
+      </w:r>
+      <w:r>
+        <w:t>A encenação da Política Nacional de Educação Digital (PNED) em Pipa/RN: culturas profissionais, território e resistências no contexto da prática.</w:t>
+      </w:r>
+    </w:p>
+    <w:p>
+      <w:pPr>
+        <w:spacing w:after="120"/>
+        <w:jc w:val="both"/>
+      </w:pPr>
+      <w:r>
+        <w:rPr>
+          <w:b/>
+        </w:rPr>
+        <w:t xml:space="preserve">Público: </w:t>
+      </w:r>
+      <w:r>
+        <w:t>Profissionais da educação da Escola Municipal Domitila Castelo, em Pipa, Tibau do Sul (RN), que atuam na direção, na coordenação pedagógica e na docência dos anos iniciais do Ensino Fundamental.</w:t>
+      </w:r>
+    </w:p>
+    <w:p>
+      <w:pPr>
+        <w:spacing w:after="120"/>
+        <w:jc w:val="both"/>
+      </w:pPr>
+      <w:r>
+        <w:rPr>
+          <w:b/>
+        </w:rPr>
+        <w:t xml:space="preserve">Objetivo do instrumento: </w:t>
+      </w:r>
+      <w:r>
+        <w:t>delinear o perfil socioprofissional da equipe, as condições materiais de trabalho, as formas preliminares pelas quais os profissionais habitam o digital, o modo como a PNED chegou até eles e as exigências de registro e de resultado que acompanham a educação digital na escola. As respostas não serão tomadas como conclusões; servem para situar cada participante e ajustar o roteiro das entrevistas.</w:t>
+      </w:r>
+    </w:p>
+    <w:p>
+      <w:pPr>
+        <w:spacing w:after="120"/>
+        <w:jc w:val="both"/>
+      </w:pPr>
+      <w:r>
+        <w:rPr>
+          <w:b/>
+        </w:rPr>
+        <w:t xml:space="preserve">Forma de aplicação: </w:t>
+      </w:r>
+      <w:r>
+        <w:t>individual, antes das entrevistas, em formulário impresso ou digital, conforme a preferência do participante.</w:t>
+      </w:r>
+    </w:p>
+    <w:p>
+      <w:pPr>
+        <w:spacing w:after="120"/>
+        <w:jc w:val="both"/>
+      </w:pPr>
+      <w:r>
+        <w:rPr>
+          <w:b/>
+        </w:rPr>
+        <w:t xml:space="preserve">Cuidados éticos: </w:t>
+      </w:r>
+      <w:r>
+        <w:t>A participação é voluntária e confidencial. As respostas serão tratadas sob anonimato, com pseudônimos, conforme as Resoluções CNS nº 466/2012 e nº 510/2016, e somente após aprovação do Comitê de Ética em Pesquisa e assinatura do Termo de Consentimento Livre e Esclarecido (TCLE).</w:t>
+      </w:r>
+    </w:p>
+    <w:p>
+      <w:pPr>
+        <w:spacing w:before="240" w:after="120"/>
+      </w:pPr>
+      <w:r>
+        <w:rPr>
+          <w:b/>
+        </w:rPr>
+        <w:t>BLOCO 1 – PERFIL E TRAJETÓRIA PROFISSIONAL</w:t>
+      </w:r>
+    </w:p>
+    <w:p>
+      <w:pPr>
+        <w:spacing w:before="120" w:after="40"/>
+      </w:pPr>
+      <w:r>
+        <w:rPr>
+          <w:b/>
+        </w:rPr>
+        <w:t xml:space="preserve">1. </w:t>
+      </w:r>
+      <w:r>
+        <w:t>Função que exerce na escola:</w:t>
+      </w:r>
+    </w:p>
+    <w:p>
+      <w:pPr>
+        <w:spacing w:after="0"/>
+        <w:ind w:left="425"/>
+      </w:pPr>
+      <w:r>
+        <w:t>( ) Docência nos anos iniciais do Ensino Fundamental</w:t>
+      </w:r>
+    </w:p>
+    <w:p>
+      <w:pPr>
+        <w:spacing w:after="0"/>
+        <w:ind w:left="425"/>
+      </w:pPr>
+      <w:r>
+        <w:t>( ) Coordenação pedagógica</w:t>
+      </w:r>
+    </w:p>
+    <w:p>
+      <w:pPr>
+        <w:spacing w:after="0"/>
+        <w:ind w:left="425"/>
+      </w:pPr>
+      <w:r>
+        <w:t>( ) Direção</w:t>
+      </w:r>
+    </w:p>
+    <w:p>
+      <w:pPr>
+        <w:spacing w:after="0"/>
+        <w:ind w:left="425"/>
+      </w:pPr>
+      <w:r>
+        <w:t>( ) Outra: ______________________</w:t>
+      </w:r>
+    </w:p>
+    <w:p>
+      <w:pPr>
+        <w:spacing w:before="120" w:after="40"/>
+      </w:pPr>
+      <w:r>
+        <w:rPr>
+          <w:b/>
+        </w:rPr>
+        <w:t xml:space="preserve">2. </w:t>
+      </w:r>
+      <w:r>
+        <w:t>Se atua na docência, em qual ano?</w:t>
+      </w:r>
+    </w:p>
+    <w:p>
+      <w:pPr>
+        <w:spacing w:after="0"/>
+        <w:ind w:left="425"/>
+      </w:pPr>
+      <w:r>
+        <w:t>[ ] 1º ano</w:t>
+      </w:r>
+    </w:p>
+    <w:p>
+      <w:pPr>
+        <w:spacing w:after="0"/>
+        <w:ind w:left="425"/>
+      </w:pPr>
+      <w:r>
+        <w:t>[ ] 2º ano</w:t>
+      </w:r>
+    </w:p>
+    <w:p>
+      <w:pPr>
+        <w:spacing w:after="0"/>
+        <w:ind w:left="425"/>
+      </w:pPr>
+      <w:r>
+        <w:t>[ ] 3º ano</w:t>
+      </w:r>
+    </w:p>
+    <w:p>
+      <w:pPr>
+        <w:spacing w:after="0"/>
+        <w:ind w:left="425"/>
+      </w:pPr>
+      <w:r>
+        <w:t>[ ] 4º ano</w:t>
+      </w:r>
+    </w:p>
+    <w:p>
+      <w:pPr>
+        <w:spacing w:after="0"/>
+        <w:ind w:left="425"/>
+      </w:pPr>
+      <w:r>
+        <w:t>[ ] 5º ano</w:t>
+      </w:r>
+    </w:p>
+    <w:p>
+      <w:pPr>
+        <w:spacing w:after="0"/>
+        <w:ind w:left="425"/>
+      </w:pPr>
+      <w:r>
+        <w:t>[ ] Não se aplica</w:t>
+      </w:r>
+    </w:p>
+    <w:p>
+      <w:pPr>
+        <w:spacing w:before="120" w:after="40"/>
+      </w:pPr>
+      <w:r>
+        <w:rPr>
+          <w:b/>
+        </w:rPr>
+        <w:t xml:space="preserve">3. </w:t>
+      </w:r>
+      <w:r>
+        <w:t>Faixa etária:</w:t>
+      </w:r>
+    </w:p>
+    <w:p>
+      <w:pPr>
+        <w:spacing w:after="0"/>
+        <w:ind w:left="425"/>
+      </w:pPr>
+      <w:r>
+        <w:t>( ) Até 29 anos</w:t>
+      </w:r>
+    </w:p>
+    <w:p>
+      <w:pPr>
+        <w:spacing w:after="0"/>
+        <w:ind w:left="425"/>
+      </w:pPr>
+      <w:r>
+        <w:t>( ) 30 a 39 anos</w:t>
+      </w:r>
+    </w:p>
+    <w:p>
+      <w:pPr>
+        <w:spacing w:after="0"/>
+        <w:ind w:left="425"/>
+      </w:pPr>
+      <w:r>
+        <w:t>( ) 40 a 49 anos</w:t>
+      </w:r>
+    </w:p>
+    <w:p>
+      <w:pPr>
+        <w:spacing w:after="0"/>
+        <w:ind w:left="425"/>
+      </w:pPr>
+      <w:r>
+        <w:t>( ) 50 a 59 anos</w:t>
+      </w:r>
+    </w:p>
+    <w:p>
+      <w:pPr>
+        <w:spacing w:after="0"/>
+        <w:ind w:left="425"/>
+      </w:pPr>
+      <w:r>
+        <w:t>( ) 60 anos ou mais</w:t>
+      </w:r>
+    </w:p>
+    <w:p>
+      <w:pPr>
+        <w:spacing w:before="120" w:after="40"/>
+      </w:pPr>
+      <w:r>
+        <w:rPr>
+          <w:b/>
+        </w:rPr>
+        <w:t xml:space="preserve">4. </w:t>
+      </w:r>
+      <w:r>
+        <w:t>Identidade de gênero:</w:t>
+      </w:r>
+    </w:p>
+    <w:p>
+      <w:pPr>
+        <w:spacing w:after="0"/>
+        <w:ind w:left="425"/>
+      </w:pPr>
+      <w:r>
+        <w:t>( ) Mulher</w:t>
+      </w:r>
+    </w:p>
+    <w:p>
+      <w:pPr>
+        <w:spacing w:after="0"/>
+        <w:ind w:left="425"/>
+      </w:pPr>
+      <w:r>
+        <w:t>( ) Homem</w:t>
+      </w:r>
+    </w:p>
+    <w:p>
+      <w:pPr>
+        <w:spacing w:after="0"/>
+        <w:ind w:left="425"/>
+      </w:pPr>
+      <w:r>
+        <w:t>( ) Outra: ______________</w:t>
+      </w:r>
+    </w:p>
+    <w:p>
+      <w:pPr>
+        <w:spacing w:after="0"/>
+        <w:ind w:left="425"/>
+      </w:pPr>
+      <w:r>
+        <w:t>( ) Prefiro não informar</w:t>
+      </w:r>
+    </w:p>
+    <w:p>
+      <w:pPr>
+        <w:spacing w:before="120" w:after="40"/>
+      </w:pPr>
+      <w:r>
+        <w:rPr>
+          <w:b/>
+        </w:rPr>
+        <w:t xml:space="preserve">5. </w:t>
+      </w:r>
+      <w:r>
+        <w:t>Formação em nível superior:</w:t>
+      </w:r>
+    </w:p>
+    <w:p>
+      <w:pPr>
+        <w:spacing w:after="0"/>
+        <w:ind w:left="425"/>
+      </w:pPr>
+      <w:r>
+        <w:t>( ) Pedagogia</w:t>
+      </w:r>
+    </w:p>
+    <w:p>
+      <w:pPr>
+        <w:spacing w:after="0"/>
+        <w:ind w:left="425"/>
+      </w:pPr>
+      <w:r>
+        <w:t>( ) Outra licenciatura: ______________</w:t>
+      </w:r>
+    </w:p>
+    <w:p>
+      <w:pPr>
+        <w:spacing w:after="0"/>
+        <w:ind w:left="425"/>
+      </w:pPr>
+      <w:r>
+        <w:t>( ) Outro curso superior: ______________</w:t>
+      </w:r>
+    </w:p>
+    <w:p>
+      <w:pPr>
+        <w:spacing w:after="0"/>
+        <w:ind w:left="425"/>
+      </w:pPr>
+      <w:r>
+        <w:t>( ) Não possui curso superior concluído</w:t>
+      </w:r>
+    </w:p>
+    <w:p>
+      <w:pPr>
+        <w:spacing w:before="120" w:after="40"/>
+      </w:pPr>
+      <w:r>
+        <w:rPr>
+          <w:b/>
+        </w:rPr>
+        <w:t xml:space="preserve">6. </w:t>
+      </w:r>
+      <w:r>
+        <w:t>Pós-graduação concluída:</w:t>
+      </w:r>
+    </w:p>
+    <w:p>
+      <w:pPr>
+        <w:spacing w:after="0"/>
+        <w:ind w:left="425"/>
+      </w:pPr>
+      <w:r>
+        <w:t>( ) Nenhuma</w:t>
+      </w:r>
+    </w:p>
+    <w:p>
+      <w:pPr>
+        <w:spacing w:after="0"/>
+        <w:ind w:left="425"/>
+      </w:pPr>
+      <w:r>
+        <w:t>( ) Especialização</w:t>
+      </w:r>
+    </w:p>
+    <w:p>
+      <w:pPr>
+        <w:spacing w:after="0"/>
+        <w:ind w:left="425"/>
+      </w:pPr>
+      <w:r>
+        <w:t>( ) Mestrado</w:t>
+      </w:r>
+    </w:p>
+    <w:p>
+      <w:pPr>
+        <w:spacing w:after="0"/>
+        <w:ind w:left="425"/>
+      </w:pPr>
+      <w:r>
+        <w:t>( ) Doutorado</w:t>
+      </w:r>
+    </w:p>
+    <w:p>
+      <w:pPr>
+        <w:spacing w:before="120" w:after="40"/>
+      </w:pPr>
+      <w:r>
+        <w:rPr>
+          <w:b/>
+        </w:rPr>
+        <w:t xml:space="preserve">7. </w:t>
+      </w:r>
+      <w:r>
+        <w:t>Tempo total de atuação na educação:</w:t>
+      </w:r>
+    </w:p>
+    <w:p>
+      <w:pPr>
+        <w:spacing w:after="0"/>
+        <w:ind w:left="425"/>
+      </w:pPr>
+      <w:r>
+        <w:t>( ) Até 5 anos</w:t>
+      </w:r>
+    </w:p>
+    <w:p>
+      <w:pPr>
+        <w:spacing w:after="0"/>
+        <w:ind w:left="425"/>
+      </w:pPr>
+      <w:r>
+        <w:t>( ) 6 a 10 anos</w:t>
+      </w:r>
+    </w:p>
+    <w:p>
+      <w:pPr>
+        <w:spacing w:after="0"/>
+        <w:ind w:left="425"/>
+      </w:pPr>
+      <w:r>
+        <w:t>( ) 11 a 20 anos</w:t>
+      </w:r>
+    </w:p>
+    <w:p>
+      <w:pPr>
+        <w:spacing w:after="0"/>
+        <w:ind w:left="425"/>
+      </w:pPr>
+      <w:r>
+        <w:t>( ) Mais de 20 anos</w:t>
+      </w:r>
+    </w:p>
+    <w:p>
+      <w:pPr>
+        <w:spacing w:before="120" w:after="40"/>
+      </w:pPr>
+      <w:r>
+        <w:rPr>
+          <w:b/>
+        </w:rPr>
+        <w:t xml:space="preserve">8. </w:t>
+      </w:r>
+      <w:r>
+        <w:t>Tempo de atuação nesta escola:</w:t>
+      </w:r>
+    </w:p>
+    <w:p>
+      <w:pPr>
+        <w:spacing w:after="0"/>
+        <w:ind w:left="425"/>
+      </w:pPr>
+      <w:r>
+        <w:t>( ) Menos de 1 ano</w:t>
+      </w:r>
+    </w:p>
+    <w:p>
+      <w:pPr>
+        <w:spacing w:after="0"/>
+        <w:ind w:left="425"/>
+      </w:pPr>
+      <w:r>
+        <w:t>( ) 1 a 5 anos</w:t>
+      </w:r>
+    </w:p>
+    <w:p>
+      <w:pPr>
+        <w:spacing w:after="0"/>
+        <w:ind w:left="425"/>
+      </w:pPr>
+      <w:r>
+        <w:t>( ) 6 a 10 anos</w:t>
+      </w:r>
+    </w:p>
+    <w:p>
+      <w:pPr>
+        <w:spacing w:after="0"/>
+        <w:ind w:left="425"/>
+      </w:pPr>
+      <w:r>
+        <w:t>( ) Mais de 10 anos</w:t>
+      </w:r>
+    </w:p>
+    <w:p>
+      <w:pPr>
+        <w:spacing w:before="120" w:after="40"/>
+      </w:pPr>
+      <w:r>
+        <w:rPr>
+          <w:b/>
+        </w:rPr>
+        <w:t xml:space="preserve">9. </w:t>
+      </w:r>
+      <w:r>
+        <w:t>Vínculo funcional com o município de Tibau do Sul:</w:t>
+      </w:r>
+    </w:p>
+    <w:p>
+      <w:pPr>
+        <w:spacing w:after="0"/>
+        <w:ind w:left="425"/>
+      </w:pPr>
+      <w:r>
+        <w:t>( ) Efetivo (concursado)</w:t>
+      </w:r>
+    </w:p>
+    <w:p>
+      <w:pPr>
+        <w:spacing w:after="0"/>
+        <w:ind w:left="425"/>
+      </w:pPr>
+      <w:r>
+        <w:t>( ) Contrato temporário</w:t>
+      </w:r>
+    </w:p>
+    <w:p>
+      <w:pPr>
+        <w:spacing w:after="0"/>
+        <w:ind w:left="425"/>
+      </w:pPr>
+      <w:r>
+        <w:t>( ) Cargo comissionado</w:t>
+      </w:r>
+    </w:p>
+    <w:p>
+      <w:pPr>
+        <w:spacing w:after="0"/>
+        <w:ind w:left="425"/>
+      </w:pPr>
+      <w:r>
+        <w:t>( ) Outro: ______________</w:t>
+      </w:r>
+    </w:p>
+    <w:p>
+      <w:pPr>
+        <w:spacing w:before="120" w:after="40"/>
+      </w:pPr>
+      <w:r>
+        <w:rPr>
+          <w:b/>
+        </w:rPr>
+        <w:t xml:space="preserve">10. </w:t>
+      </w:r>
+      <w:r>
+        <w:t>Atua em outra instituição de ensino?</w:t>
+      </w:r>
+    </w:p>
+    <w:p>
+      <w:pPr>
+        <w:spacing w:after="0"/>
+        <w:ind w:left="425"/>
+      </w:pPr>
+      <w:r>
+        <w:t>( ) Sim</w:t>
+      </w:r>
+    </w:p>
+    <w:p>
+      <w:pPr>
+        <w:spacing w:after="0"/>
+        <w:ind w:left="425"/>
+      </w:pPr>
+      <w:r>
+        <w:t>( ) Não</w:t>
+      </w:r>
+    </w:p>
+    <w:p>
+      <w:pPr>
+        <w:spacing w:before="120" w:after="40"/>
+      </w:pPr>
+      <w:r>
+        <w:rPr>
+          <w:b/>
+        </w:rPr>
+        <w:t xml:space="preserve">11. </w:t>
+      </w:r>
+      <w:r>
+        <w:t>Qual é a sua relação com o território de Pipa?</w:t>
+      </w:r>
+    </w:p>
+    <w:p>
+      <w:pPr>
+        <w:spacing w:after="0"/>
+        <w:ind w:left="425"/>
+      </w:pPr>
+      <w:r>
+        <w:t>( ) Nasci e moro em Pipa</w:t>
+      </w:r>
+    </w:p>
+    <w:p>
+      <w:pPr>
+        <w:spacing w:after="0"/>
+        <w:ind w:left="425"/>
+      </w:pPr>
+      <w:r>
+        <w:t>( ) Moro em Pipa, mas vim de outro lugar</w:t>
+      </w:r>
+    </w:p>
+    <w:p>
+      <w:pPr>
+        <w:spacing w:after="0"/>
+        <w:ind w:left="425"/>
+      </w:pPr>
+      <w:r>
+        <w:t>( ) Moro em outro distrito ou município e me desloco para trabalhar</w:t>
+      </w:r>
+    </w:p>
+    <w:p>
+      <w:pPr>
+        <w:spacing w:after="0"/>
+        <w:ind w:left="425"/>
+      </w:pPr>
+      <w:r>
+        <w:t>( ) Outra: ______________</w:t>
+      </w:r>
+    </w:p>
+    <w:p>
+      <w:pPr>
+        <w:spacing w:before="240" w:after="120"/>
+      </w:pPr>
+      <w:r>
+        <w:rPr>
+          <w:b/>
+        </w:rPr>
+        <w:t>BLOCO 2 – FORMAÇÃO E RELAÇÃO COM AS TECNOLOGIAS DIGITAIS</w:t>
+      </w:r>
+    </w:p>
+    <w:p>
+      <w:pPr>
+        <w:spacing w:before="120" w:after="40"/>
+      </w:pPr>
+      <w:r>
+        <w:rPr>
+          <w:b/>
+        </w:rPr>
+        <w:t xml:space="preserve">12. </w:t>
+      </w:r>
+      <w:r>
+        <w:t>Sua formação inicial abordou o uso pedagógico das tecnologias digitais?</w:t>
+      </w:r>
+    </w:p>
+    <w:p>
+      <w:pPr>
+        <w:spacing w:after="0"/>
+        <w:ind w:left="425"/>
+      </w:pPr>
+      <w:r>
+        <w:t>( ) Sim, com disciplinas ou módulos específicos</w:t>
+      </w:r>
+    </w:p>
+    <w:p>
+      <w:pPr>
+        <w:spacing w:after="0"/>
+        <w:ind w:left="425"/>
+      </w:pPr>
+      <w:r>
+        <w:t>( ) De forma indireta ou superficial</w:t>
+      </w:r>
+    </w:p>
+    <w:p>
+      <w:pPr>
+        <w:spacing w:after="0"/>
+        <w:ind w:left="425"/>
+      </w:pPr>
+      <w:r>
+        <w:t>( ) Não abordou</w:t>
+      </w:r>
+    </w:p>
+    <w:p>
+      <w:pPr>
+        <w:spacing w:before="120" w:after="40"/>
+      </w:pPr>
+      <w:r>
+        <w:rPr>
+          <w:b/>
+        </w:rPr>
+        <w:t xml:space="preserve">13. </w:t>
+      </w:r>
+      <w:r>
+        <w:t>Em que ano você participou pela primeira vez de uma formação continuada voltada à educação digital?</w:t>
+      </w:r>
+    </w:p>
+    <w:p>
+      <w:pPr>
+        <w:spacing w:after="0"/>
+        <w:ind w:left="425"/>
+      </w:pPr>
+      <w:r>
+        <w:t>( ) Antes de 2023</w:t>
+      </w:r>
+    </w:p>
+    <w:p>
+      <w:pPr>
+        <w:spacing w:after="0"/>
+        <w:ind w:left="425"/>
+      </w:pPr>
+      <w:r>
+        <w:t>( ) Em 2023</w:t>
+      </w:r>
+    </w:p>
+    <w:p>
+      <w:pPr>
+        <w:spacing w:after="0"/>
+        <w:ind w:left="425"/>
+      </w:pPr>
+      <w:r>
+        <w:t>( ) Em 2024</w:t>
+      </w:r>
+    </w:p>
+    <w:p>
+      <w:pPr>
+        <w:spacing w:after="0"/>
+        <w:ind w:left="425"/>
+      </w:pPr>
+      <w:r>
+        <w:t>( ) Em 2025</w:t>
+      </w:r>
+    </w:p>
+    <w:p>
+      <w:pPr>
+        <w:spacing w:after="0"/>
+        <w:ind w:left="425"/>
+      </w:pPr>
+      <w:r>
+        <w:t>( ) Em 2026</w:t>
+      </w:r>
+    </w:p>
+    <w:p>
+      <w:pPr>
+        <w:spacing w:after="0"/>
+        <w:ind w:left="425"/>
+      </w:pPr>
+      <w:r>
+        <w:t>( ) Não participei de formação com esse foco</w:t>
+      </w:r>
+    </w:p>
+    <w:p>
+      <w:pPr>
+        <w:spacing w:before="120" w:after="40"/>
+      </w:pPr>
+      <w:r>
+        <w:rPr>
+          <w:b/>
+        </w:rPr>
+        <w:t xml:space="preserve">14. </w:t>
+      </w:r>
+      <w:r>
+        <w:t>Quem ofertou essa formação? (Pode assinalar mais de uma)</w:t>
+      </w:r>
+    </w:p>
+    <w:p>
+      <w:pPr>
+        <w:spacing w:after="0"/>
+        <w:ind w:left="425"/>
+      </w:pPr>
+      <w:r>
+        <w:t>[ ] Secretaria Municipal de Educação de Tibau do Sul</w:t>
+      </w:r>
+    </w:p>
+    <w:p>
+      <w:pPr>
+        <w:spacing w:after="0"/>
+        <w:ind w:left="425"/>
+      </w:pPr>
+      <w:r>
+        <w:t>[ ] A própria escola</w:t>
+      </w:r>
+    </w:p>
+    <w:p>
+      <w:pPr>
+        <w:spacing w:after="0"/>
+        <w:ind w:left="425"/>
+      </w:pPr>
+      <w:r>
+        <w:t>[ ] MEC ou plataformas federais</w:t>
+      </w:r>
+    </w:p>
+    <w:p>
+      <w:pPr>
+        <w:spacing w:after="0"/>
+        <w:ind w:left="425"/>
+      </w:pPr>
+      <w:r>
+        <w:t>[ ] Universidade ou instituição de ensino superior</w:t>
+      </w:r>
+    </w:p>
+    <w:p>
+      <w:pPr>
+        <w:spacing w:after="0"/>
+        <w:ind w:left="425"/>
+      </w:pPr>
+      <w:r>
+        <w:t>[ ] Iniciativa própria (cursos online, entidades)</w:t>
+      </w:r>
+    </w:p>
+    <w:p>
+      <w:pPr>
+        <w:spacing w:after="0"/>
+        <w:ind w:left="425"/>
+      </w:pPr>
+      <w:r>
+        <w:t>[ ] Outra: ______________</w:t>
+      </w:r>
+    </w:p>
+    <w:p>
+      <w:pPr>
+        <w:spacing w:after="0"/>
+        <w:ind w:left="425"/>
+      </w:pPr>
+      <w:r>
+        <w:t>[ ] Não se aplica</w:t>
+      </w:r>
+    </w:p>
+    <w:p>
+      <w:pPr>
+        <w:spacing w:before="120" w:after="40"/>
+      </w:pPr>
+      <w:r>
+        <w:rPr>
+          <w:b/>
+        </w:rPr>
+        <w:t xml:space="preserve">15. </w:t>
+      </w:r>
+      <w:r>
+        <w:t>Que conteúdos a formação abordou? (Pode assinalar mais de uma)</w:t>
+      </w:r>
+    </w:p>
+    <w:p>
+      <w:pPr>
+        <w:spacing w:after="0"/>
+        <w:ind w:left="425"/>
+      </w:pPr>
+      <w:r>
+        <w:t>[ ] Pensamento computacional</w:t>
+      </w:r>
+    </w:p>
+    <w:p>
+      <w:pPr>
+        <w:spacing w:after="0"/>
+        <w:ind w:left="425"/>
+      </w:pPr>
+      <w:r>
+        <w:t>[ ] Mundo digital (dispositivos, internet e seu funcionamento)</w:t>
+      </w:r>
+    </w:p>
+    <w:p>
+      <w:pPr>
+        <w:spacing w:after="0"/>
+        <w:ind w:left="425"/>
+      </w:pPr>
+      <w:r>
+        <w:t>[ ] Cultura digital</w:t>
+      </w:r>
+    </w:p>
+    <w:p>
+      <w:pPr>
+        <w:spacing w:after="0"/>
+        <w:ind w:left="425"/>
+      </w:pPr>
+      <w:r>
+        <w:t>[ ] Direitos digitais e proteção de dados</w:t>
+      </w:r>
+    </w:p>
+    <w:p>
+      <w:pPr>
+        <w:spacing w:after="0"/>
+        <w:ind w:left="425"/>
+      </w:pPr>
+      <w:r>
+        <w:t>[ ] Uso de ferramentas e aplicativos</w:t>
+      </w:r>
+    </w:p>
+    <w:p>
+      <w:pPr>
+        <w:spacing w:after="0"/>
+        <w:ind w:left="425"/>
+      </w:pPr>
+      <w:r>
+        <w:t>[ ] Tecnologia assistiva</w:t>
+      </w:r>
+    </w:p>
+    <w:p>
+      <w:pPr>
+        <w:spacing w:after="0"/>
+        <w:ind w:left="425"/>
+      </w:pPr>
+      <w:r>
+        <w:t>[ ] Outro: ______________</w:t>
+      </w:r>
+    </w:p>
+    <w:p>
+      <w:pPr>
+        <w:spacing w:after="0"/>
+        <w:ind w:left="425"/>
+      </w:pPr>
+      <w:r>
+        <w:t>[ ] Não se aplica</w:t>
+      </w:r>
+    </w:p>
+    <w:p>
+      <w:pPr>
+        <w:spacing w:before="120" w:after="40"/>
+      </w:pPr>
+      <w:r>
+        <w:rPr>
+          <w:b/>
+        </w:rPr>
+        <w:t xml:space="preserve">16. </w:t>
+      </w:r>
+      <w:r>
+        <w:t>Como você avalia a relação entre essas formações e as condições reais da escola?</w:t>
+      </w:r>
+    </w:p>
+    <w:p>
+      <w:pPr>
+        <w:spacing w:after="0"/>
+        <w:ind w:left="425"/>
+      </w:pPr>
+      <w:r>
+        <w:t>( ) Muito próxima da realidade da escola</w:t>
+      </w:r>
+    </w:p>
+    <w:p>
+      <w:pPr>
+        <w:spacing w:after="0"/>
+        <w:ind w:left="425"/>
+      </w:pPr>
+      <w:r>
+        <w:t>( ) Parcial, com pouca relação com as condições da escola</w:t>
+      </w:r>
+    </w:p>
+    <w:p>
+      <w:pPr>
+        <w:spacing w:after="0"/>
+        <w:ind w:left="425"/>
+      </w:pPr>
+      <w:r>
+        <w:t>( ) Distante, com foco predominantemente teórico ou técnico</w:t>
+      </w:r>
+    </w:p>
+    <w:p>
+      <w:pPr>
+        <w:spacing w:after="0"/>
+        <w:ind w:left="425"/>
+      </w:pPr>
+      <w:r>
+        <w:t>( ) Não participei de formações</w:t>
+      </w:r>
+    </w:p>
+    <w:p>
+      <w:pPr>
+        <w:spacing w:before="120" w:after="40"/>
+      </w:pPr>
+      <w:r>
+        <w:rPr>
+          <w:b/>
+        </w:rPr>
+        <w:t xml:space="preserve">17. </w:t>
+      </w:r>
+      <w:r>
+        <w:t>Com que frequência você usa tecnologias digitais na sua vida pessoal (comunicação, informação, lazer)?</w:t>
+      </w:r>
+    </w:p>
+    <w:p>
+      <w:pPr>
+        <w:spacing w:after="0"/>
+        <w:ind w:left="425"/>
+      </w:pPr>
+      <w:r>
+        <w:t>( ) Diariamente</w:t>
+      </w:r>
+    </w:p>
+    <w:p>
+      <w:pPr>
+        <w:spacing w:after="0"/>
+        <w:ind w:left="425"/>
+      </w:pPr>
+      <w:r>
+        <w:t>( ) Algumas vezes por semana</w:t>
+      </w:r>
+    </w:p>
+    <w:p>
+      <w:pPr>
+        <w:spacing w:after="0"/>
+        <w:ind w:left="425"/>
+      </w:pPr>
+      <w:r>
+        <w:t>( ) Raramente</w:t>
+      </w:r>
+    </w:p>
+    <w:p>
+      <w:pPr>
+        <w:spacing w:after="0"/>
+        <w:ind w:left="425"/>
+      </w:pPr>
+      <w:r>
+        <w:t>( ) Nunca</w:t>
+      </w:r>
+    </w:p>
+    <w:p>
+      <w:pPr>
+        <w:spacing w:before="120" w:after="40"/>
+      </w:pPr>
+      <w:r>
+        <w:rPr>
+          <w:b/>
+        </w:rPr>
+        <w:t xml:space="preserve">18. </w:t>
+      </w:r>
+      <w:r>
+        <w:t>Como você avalia sua segurança para usar recursos digitais no trabalho?</w:t>
+      </w:r>
+    </w:p>
+    <w:p>
+      <w:pPr>
+        <w:spacing w:after="0"/>
+        <w:ind w:left="425"/>
+      </w:pPr>
+      <w:r>
+        <w:t>( ) Alta</w:t>
+      </w:r>
+    </w:p>
+    <w:p>
+      <w:pPr>
+        <w:spacing w:after="0"/>
+        <w:ind w:left="425"/>
+      </w:pPr>
+      <w:r>
+        <w:t>( ) Média</w:t>
+      </w:r>
+    </w:p>
+    <w:p>
+      <w:pPr>
+        <w:spacing w:after="0"/>
+        <w:ind w:left="425"/>
+      </w:pPr>
+      <w:r>
+        <w:t>( ) Baixa</w:t>
+      </w:r>
+    </w:p>
+    <w:p>
+      <w:pPr>
+        <w:spacing w:after="0"/>
+        <w:ind w:left="425"/>
+      </w:pPr>
+      <w:r>
+        <w:t>( ) Muito baixa</w:t>
+      </w:r>
+    </w:p>
+    <w:p>
+      <w:pPr>
+        <w:spacing w:before="240" w:after="120"/>
+      </w:pPr>
+      <w:r>
+        <w:rPr>
+          <w:b/>
+        </w:rPr>
+        <w:t>BLOCO 3 – CONDIÇÕES MATERIAIS DE TRABALHO E TERRITÓRIO</w:t>
+      </w:r>
+    </w:p>
+    <w:p>
+      <w:pPr>
+        <w:spacing w:before="120" w:after="40"/>
+      </w:pPr>
+      <w:r>
+        <w:rPr>
+          <w:b/>
+        </w:rPr>
+        <w:t xml:space="preserve">19. </w:t>
+      </w:r>
+      <w:r>
+        <w:t>Com que frequência o laboratório de informática é usado em atividades ligadas à sua função?</w:t>
+      </w:r>
+    </w:p>
+    <w:p>
+      <w:pPr>
+        <w:spacing w:after="0"/>
+        <w:ind w:left="425"/>
+      </w:pPr>
+      <w:r>
+        <w:t>( ) Ao menos uma vez por semana</w:t>
+      </w:r>
+    </w:p>
+    <w:p>
+      <w:pPr>
+        <w:spacing w:after="0"/>
+        <w:ind w:left="425"/>
+      </w:pPr>
+      <w:r>
+        <w:t>( ) Uma ou duas vezes por mês</w:t>
+      </w:r>
+    </w:p>
+    <w:p>
+      <w:pPr>
+        <w:spacing w:after="0"/>
+        <w:ind w:left="425"/>
+      </w:pPr>
+      <w:r>
+        <w:t>( ) Raramente</w:t>
+      </w:r>
+    </w:p>
+    <w:p>
+      <w:pPr>
+        <w:spacing w:after="0"/>
+        <w:ind w:left="425"/>
+      </w:pPr>
+      <w:r>
+        <w:t>( ) Nunca</w:t>
+      </w:r>
+    </w:p>
+    <w:p>
+      <w:pPr>
+        <w:spacing w:after="0"/>
+        <w:ind w:left="425"/>
+      </w:pPr>
+      <w:r>
+        <w:t>( ) A escola não dispõe de laboratório em funcionamento</w:t>
+      </w:r>
+    </w:p>
+    <w:p>
+      <w:pPr>
+        <w:spacing w:before="120" w:after="40"/>
+      </w:pPr>
+      <w:r>
+        <w:rPr>
+          <w:b/>
+        </w:rPr>
+        <w:t xml:space="preserve">20. </w:t>
+      </w:r>
+      <w:r>
+        <w:t>Os equipamentos da escola (computadores, projetores, televisores, caixas de som) estão disponíveis e funcionando quando você precisa?</w:t>
+      </w:r>
+    </w:p>
+    <w:p>
+      <w:pPr>
+        <w:spacing w:after="0"/>
+        <w:ind w:left="425"/>
+      </w:pPr>
+      <w:r>
+        <w:t>( ) Sempre</w:t>
+      </w:r>
+    </w:p>
+    <w:p>
+      <w:pPr>
+        <w:spacing w:after="0"/>
+        <w:ind w:left="425"/>
+      </w:pPr>
+      <w:r>
+        <w:t>( ) Com frequência, mediante agendamento</w:t>
+      </w:r>
+    </w:p>
+    <w:p>
+      <w:pPr>
+        <w:spacing w:after="0"/>
+        <w:ind w:left="425"/>
+      </w:pPr>
+      <w:r>
+        <w:t>( ) Raramente</w:t>
+      </w:r>
+    </w:p>
+    <w:p>
+      <w:pPr>
+        <w:spacing w:after="0"/>
+        <w:ind w:left="425"/>
+      </w:pPr>
+      <w:r>
+        <w:t>( ) Não estão disponíveis</w:t>
+      </w:r>
+    </w:p>
+    <w:p>
+      <w:pPr>
+        <w:spacing w:before="120" w:after="40"/>
+      </w:pPr>
+      <w:r>
+        <w:rPr>
+          <w:b/>
+        </w:rPr>
+        <w:t xml:space="preserve">21. </w:t>
+      </w:r>
+      <w:r>
+        <w:t>Como é a conexão de internet nos espaços em que você trabalha com as crianças?</w:t>
+      </w:r>
+    </w:p>
+    <w:p>
+      <w:pPr>
+        <w:spacing w:after="0"/>
+        <w:ind w:left="425"/>
+      </w:pPr>
+      <w:r>
+        <w:t>( ) Estável e suficiente</w:t>
+      </w:r>
+    </w:p>
+    <w:p>
+      <w:pPr>
+        <w:spacing w:after="0"/>
+        <w:ind w:left="425"/>
+      </w:pPr>
+      <w:r>
+        <w:t>( ) Oscila ou não alcança todos os ambientes</w:t>
+      </w:r>
+    </w:p>
+    <w:p>
+      <w:pPr>
+        <w:spacing w:after="0"/>
+        <w:ind w:left="425"/>
+      </w:pPr>
+      <w:r>
+        <w:t>( ) Atende principalmente à parte administrativa</w:t>
+      </w:r>
+    </w:p>
+    <w:p>
+      <w:pPr>
+        <w:spacing w:after="0"/>
+        <w:ind w:left="425"/>
+      </w:pPr>
+      <w:r>
+        <w:t>( ) Não há conexão nas salas de aula</w:t>
+      </w:r>
+    </w:p>
+    <w:p>
+      <w:pPr>
+        <w:spacing w:before="120" w:after="40"/>
+      </w:pPr>
+      <w:r>
+        <w:rPr>
+          <w:b/>
+        </w:rPr>
+        <w:t xml:space="preserve">22. </w:t>
+      </w:r>
+      <w:r>
+        <w:t>A escola ou a Secretaria oferece suporte técnico para a manutenção dos equipamentos?</w:t>
+      </w:r>
+    </w:p>
+    <w:p>
+      <w:pPr>
+        <w:spacing w:after="0"/>
+        <w:ind w:left="425"/>
+      </w:pPr>
+      <w:r>
+        <w:t>( ) Sim, contínuo e acessível</w:t>
+      </w:r>
+    </w:p>
+    <w:p>
+      <w:pPr>
+        <w:spacing w:after="0"/>
+        <w:ind w:left="425"/>
+      </w:pPr>
+      <w:r>
+        <w:t>( ) Esporádico ou demorado</w:t>
+      </w:r>
+    </w:p>
+    <w:p>
+      <w:pPr>
+        <w:spacing w:after="0"/>
+        <w:ind w:left="425"/>
+      </w:pPr>
+      <w:r>
+        <w:t>( ) Não há suporte técnico</w:t>
+      </w:r>
+    </w:p>
+    <w:p>
+      <w:pPr>
+        <w:spacing w:before="120" w:after="40"/>
+      </w:pPr>
+      <w:r>
+        <w:rPr>
+          <w:b/>
+        </w:rPr>
+        <w:t xml:space="preserve">23. </w:t>
+      </w:r>
+      <w:r>
+        <w:t>Sua jornada inclui tempo de planejamento suficiente para preparar atividades com recursos digitais?</w:t>
+      </w:r>
+    </w:p>
+    <w:p>
+      <w:pPr>
+        <w:spacing w:after="0"/>
+        <w:ind w:left="425"/>
+      </w:pPr>
+      <w:r>
+        <w:t>( ) Sim</w:t>
+      </w:r>
+    </w:p>
+    <w:p>
+      <w:pPr>
+        <w:spacing w:after="0"/>
+        <w:ind w:left="425"/>
+      </w:pPr>
+      <w:r>
+        <w:t>( ) Parcialmente</w:t>
+      </w:r>
+    </w:p>
+    <w:p>
+      <w:pPr>
+        <w:spacing w:after="0"/>
+        <w:ind w:left="425"/>
+      </w:pPr>
+      <w:r>
+        <w:t>( ) Não</w:t>
+      </w:r>
+    </w:p>
+    <w:p>
+      <w:pPr>
+        <w:spacing w:before="120" w:after="40"/>
+      </w:pPr>
+      <w:r>
+        <w:rPr>
+          <w:b/>
+        </w:rPr>
+        <w:t xml:space="preserve">24. </w:t>
+      </w:r>
+      <w:r>
+        <w:t>Com que frequência você prepara, fora do horário de trabalho, atividades ou registros ligados à educação digital?</w:t>
+      </w:r>
+    </w:p>
+    <w:p>
+      <w:pPr>
+        <w:spacing w:after="0"/>
+        <w:ind w:left="425"/>
+      </w:pPr>
+      <w:r>
+        <w:t>( ) Frequentemente</w:t>
+      </w:r>
+    </w:p>
+    <w:p>
+      <w:pPr>
+        <w:spacing w:after="0"/>
+        <w:ind w:left="425"/>
+      </w:pPr>
+      <w:r>
+        <w:t>( ) Às vezes</w:t>
+      </w:r>
+    </w:p>
+    <w:p>
+      <w:pPr>
+        <w:spacing w:after="0"/>
+        <w:ind w:left="425"/>
+      </w:pPr>
+      <w:r>
+        <w:t>( ) Raramente</w:t>
+      </w:r>
+    </w:p>
+    <w:p>
+      <w:pPr>
+        <w:spacing w:after="0"/>
+        <w:ind w:left="425"/>
+      </w:pPr>
+      <w:r>
+        <w:t>( ) Nunca</w:t>
+      </w:r>
+    </w:p>
+    <w:p>
+      <w:pPr>
+        <w:spacing w:before="120" w:after="40"/>
+      </w:pPr>
+      <w:r>
+        <w:rPr>
+          <w:b/>
+        </w:rPr>
+        <w:t xml:space="preserve">25. </w:t>
+      </w:r>
+      <w:r>
+        <w:t>Você já usou recursos próprios (celular, pacote de dados, impressão, material comprado) para realizar atividades da escola?</w:t>
+      </w:r>
+    </w:p>
+    <w:p>
+      <w:pPr>
+        <w:spacing w:after="0"/>
+        <w:ind w:left="425"/>
+      </w:pPr>
+      <w:r>
+        <w:t>( ) Frequentemente</w:t>
+      </w:r>
+    </w:p>
+    <w:p>
+      <w:pPr>
+        <w:spacing w:after="0"/>
+        <w:ind w:left="425"/>
+      </w:pPr>
+      <w:r>
+        <w:t>( ) Às vezes</w:t>
+      </w:r>
+    </w:p>
+    <w:p>
+      <w:pPr>
+        <w:spacing w:after="0"/>
+        <w:ind w:left="425"/>
+      </w:pPr>
+      <w:r>
+        <w:t>( ) Raramente</w:t>
+      </w:r>
+    </w:p>
+    <w:p>
+      <w:pPr>
+        <w:spacing w:after="0"/>
+        <w:ind w:left="425"/>
+      </w:pPr>
+      <w:r>
+        <w:t>( ) Nunca</w:t>
+      </w:r>
+    </w:p>
+    <w:p>
+      <w:pPr>
+        <w:spacing w:before="120" w:after="40"/>
+      </w:pPr>
+      <w:r>
+        <w:rPr>
+          <w:b/>
+        </w:rPr>
+        <w:t xml:space="preserve">26. </w:t>
+      </w:r>
+      <w:r>
+        <w:t>Na sua percepção, as características de Pipa (turismo, desigualdades entre áreas do distrito, oscilação de sinal, rotina das famílias) influenciam o acesso das crianças ao digital?</w:t>
+      </w:r>
+    </w:p>
+    <w:p>
+      <w:pPr>
+        <w:spacing w:after="0"/>
+        <w:ind w:left="425"/>
+      </w:pPr>
+      <w:r>
+        <w:t>( ) Sim</w:t>
+      </w:r>
+    </w:p>
+    <w:p>
+      <w:pPr>
+        <w:spacing w:after="0"/>
+        <w:ind w:left="425"/>
+      </w:pPr>
+      <w:r>
+        <w:t>( ) Parcialmente</w:t>
+      </w:r>
+    </w:p>
+    <w:p>
+      <w:pPr>
+        <w:spacing w:after="0"/>
+        <w:ind w:left="425"/>
+      </w:pPr>
+      <w:r>
+        <w:t>( ) Não</w:t>
+      </w:r>
+    </w:p>
+    <w:p>
+      <w:pPr>
+        <w:spacing w:before="120" w:after="40"/>
+      </w:pPr>
+      <w:r>
+        <w:rPr>
+          <w:b/>
+        </w:rPr>
+        <w:t xml:space="preserve">27. </w:t>
+      </w:r>
+      <w:r>
+        <w:t>Se respondeu sim ou parcialmente, de que modo essa influência aparece no cotidiano da escola?</w:t>
+      </w:r>
+    </w:p>
+    <w:p>
+      <w:pPr>
+        <w:spacing w:after="0"/>
+      </w:pPr>
+      <w:r>
+        <w:t>______________________________________________________________________________</w:t>
+      </w:r>
+    </w:p>
+    <w:p>
+      <w:pPr>
+        <w:spacing w:after="0"/>
+      </w:pPr>
+      <w:r>
+        <w:t>______________________________________________________________________________</w:t>
+      </w:r>
+    </w:p>
+    <w:p>
+      <w:pPr>
+        <w:spacing w:after="0"/>
+      </w:pPr>
+      <w:r>
+        <w:t>______________________________________________________________________________</w:t>
+      </w:r>
+    </w:p>
+    <w:p>
+      <w:pPr>
+        <w:spacing w:before="240" w:after="120"/>
+      </w:pPr>
+      <w:r>
+        <w:rPr>
+          <w:b/>
+        </w:rPr>
+        <w:t>BLOCO 4 – A PNED NA ESCOLA E AS EXIGÊNCIAS DE REGISTRO E RESULTADO</w:t>
+      </w:r>
+    </w:p>
+    <w:p>
+      <w:pPr>
+        <w:spacing w:before="120" w:after="40"/>
+      </w:pPr>
+      <w:r>
+        <w:rPr>
+          <w:b/>
+        </w:rPr>
+        <w:t xml:space="preserve">28. </w:t>
+      </w:r>
+      <w:r>
+        <w:t>Você conhece a Política Nacional de Educação Digital (Lei nº 14.533/2023)?</w:t>
+      </w:r>
+    </w:p>
+    <w:p>
+      <w:pPr>
+        <w:spacing w:after="0"/>
+        <w:ind w:left="425"/>
+      </w:pPr>
+      <w:r>
+        <w:t>( ) Conheço o texto ou seus eixos</w:t>
+      </w:r>
+    </w:p>
+    <w:p>
+      <w:pPr>
+        <w:spacing w:after="0"/>
+        <w:ind w:left="425"/>
+      </w:pPr>
+      <w:r>
+        <w:t>( ) Já ouvi falar, mas não conheço o conteúdo</w:t>
+      </w:r>
+    </w:p>
+    <w:p>
+      <w:pPr>
+        <w:spacing w:after="0"/>
+        <w:ind w:left="425"/>
+      </w:pPr>
+      <w:r>
+        <w:t>( ) Não conheço</w:t>
+      </w:r>
+    </w:p>
+    <w:p>
+      <w:pPr>
+        <w:spacing w:before="120" w:after="40"/>
+      </w:pPr>
+      <w:r>
+        <w:rPr>
+          <w:b/>
+        </w:rPr>
+        <w:t xml:space="preserve">29. </w:t>
+      </w:r>
+      <w:r>
+        <w:t>Por qual meio a PNED chegou até você? (Pode assinalar mais de uma)</w:t>
+      </w:r>
+    </w:p>
+    <w:p>
+      <w:pPr>
+        <w:spacing w:after="0"/>
+        <w:ind w:left="425"/>
+      </w:pPr>
+      <w:r>
+        <w:t>[ ] Orientações ou documentos da escola</w:t>
+      </w:r>
+    </w:p>
+    <w:p>
+      <w:pPr>
+        <w:spacing w:after="0"/>
+        <w:ind w:left="425"/>
+      </w:pPr>
+      <w:r>
+        <w:t>[ ] Reuniões ou formações da Secretaria Municipal de Educação</w:t>
+      </w:r>
+    </w:p>
+    <w:p>
+      <w:pPr>
+        <w:spacing w:after="0"/>
+        <w:ind w:left="425"/>
+      </w:pPr>
+      <w:r>
+        <w:t>[ ] Cursos de formação continuada</w:t>
+      </w:r>
+    </w:p>
+    <w:p>
+      <w:pPr>
+        <w:spacing w:after="0"/>
+        <w:ind w:left="425"/>
+      </w:pPr>
+      <w:r>
+        <w:t>[ ] BNCC ou documentos curriculares</w:t>
+      </w:r>
+    </w:p>
+    <w:p>
+      <w:pPr>
+        <w:spacing w:after="0"/>
+        <w:ind w:left="425"/>
+      </w:pPr>
+      <w:r>
+        <w:t>[ ] Imprensa, redes sociais ou internet</w:t>
+      </w:r>
+    </w:p>
+    <w:p>
+      <w:pPr>
+        <w:spacing w:after="0"/>
+        <w:ind w:left="425"/>
+      </w:pPr>
+      <w:r>
+        <w:t>[ ] Outro: ______________</w:t>
+      </w:r>
+    </w:p>
+    <w:p>
+      <w:pPr>
+        <w:spacing w:after="0"/>
+        <w:ind w:left="425"/>
+      </w:pPr>
+      <w:r>
+        <w:t>[ ] Não conheço a política</w:t>
+      </w:r>
+    </w:p>
+    <w:p>
+      <w:pPr>
+        <w:spacing w:before="120" w:after="40"/>
+      </w:pPr>
+      <w:r>
+        <w:rPr>
+          <w:b/>
+        </w:rPr>
+        <w:t xml:space="preserve">30. </w:t>
+      </w:r>
+      <w:r>
+        <w:t>A escola ou a rede ofereceu orientações sobre a PNED?</w:t>
+      </w:r>
+    </w:p>
+    <w:p>
+      <w:pPr>
+        <w:spacing w:after="0"/>
+        <w:ind w:left="425"/>
+      </w:pPr>
+      <w:r>
+        <w:t>( ) Sim, com debate e orientações pedagógicas</w:t>
+      </w:r>
+    </w:p>
+    <w:p>
+      <w:pPr>
+        <w:spacing w:after="0"/>
+        <w:ind w:left="425"/>
+      </w:pPr>
+      <w:r>
+        <w:t>( ) Sim, mas de forma superficial</w:t>
+      </w:r>
+    </w:p>
+    <w:p>
+      <w:pPr>
+        <w:spacing w:after="0"/>
+        <w:ind w:left="425"/>
+      </w:pPr>
+      <w:r>
+        <w:t>( ) Não houve orientação</w:t>
+      </w:r>
+    </w:p>
+    <w:p>
+      <w:pPr>
+        <w:spacing w:before="120" w:after="40"/>
+      </w:pPr>
+      <w:r>
+        <w:rPr>
+          <w:b/>
+        </w:rPr>
+        <w:t xml:space="preserve">31. </w:t>
+      </w:r>
+      <w:r>
+        <w:t>O trabalho com educação digital na escola costuma gerar algum tipo de registro, relatório, planilha, evidência fotográfica ou lançamento em sistema?</w:t>
+      </w:r>
+    </w:p>
+    <w:p>
+      <w:pPr>
+        <w:spacing w:after="0"/>
+        <w:ind w:left="425"/>
+      </w:pPr>
+      <w:r>
+        <w:t>( ) Sim, com frequência</w:t>
+      </w:r>
+    </w:p>
+    <w:p>
+      <w:pPr>
+        <w:spacing w:after="0"/>
+        <w:ind w:left="425"/>
+      </w:pPr>
+      <w:r>
+        <w:t>( ) Às vezes</w:t>
+      </w:r>
+    </w:p>
+    <w:p>
+      <w:pPr>
+        <w:spacing w:after="0"/>
+        <w:ind w:left="425"/>
+      </w:pPr>
+      <w:r>
+        <w:t>( ) Não</w:t>
+      </w:r>
+    </w:p>
+    <w:p>
+      <w:pPr>
+        <w:spacing w:before="120" w:after="40"/>
+      </w:pPr>
+      <w:r>
+        <w:rPr>
+          <w:b/>
+        </w:rPr>
+        <w:t xml:space="preserve">32. </w:t>
+      </w:r>
+      <w:r>
+        <w:t>Se sim, para quem esses registros são encaminhados? (Pode assinalar mais de uma)</w:t>
+      </w:r>
+    </w:p>
+    <w:p>
+      <w:pPr>
+        <w:spacing w:after="0"/>
+        <w:ind w:left="425"/>
+      </w:pPr>
+      <w:r>
+        <w:t>[ ] Coordenação ou direção da escola</w:t>
+      </w:r>
+    </w:p>
+    <w:p>
+      <w:pPr>
+        <w:spacing w:after="0"/>
+        <w:ind w:left="425"/>
+      </w:pPr>
+      <w:r>
+        <w:t>[ ] Secretaria Municipal de Educação</w:t>
+      </w:r>
+    </w:p>
+    <w:p>
+      <w:pPr>
+        <w:spacing w:after="0"/>
+        <w:ind w:left="425"/>
+      </w:pPr>
+      <w:r>
+        <w:t>[ ] Plataformas ou programas federais</w:t>
+      </w:r>
+    </w:p>
+    <w:p>
+      <w:pPr>
+        <w:spacing w:after="0"/>
+        <w:ind w:left="425"/>
+      </w:pPr>
+      <w:r>
+        <w:t>[ ] Programas ou empresas parceiras</w:t>
+      </w:r>
+    </w:p>
+    <w:p>
+      <w:pPr>
+        <w:spacing w:after="0"/>
+        <w:ind w:left="425"/>
+      </w:pPr>
+      <w:r>
+        <w:t>[ ] Outro: ______________</w:t>
+      </w:r>
+    </w:p>
+    <w:p>
+      <w:pPr>
+        <w:spacing w:after="0"/>
+        <w:ind w:left="425"/>
+      </w:pPr>
+      <w:r>
+        <w:t>[ ] Não se aplica</w:t>
+      </w:r>
+    </w:p>
+    <w:p>
+      <w:pPr>
+        <w:spacing w:before="120" w:after="40"/>
+      </w:pPr>
+      <w:r>
+        <w:rPr>
+          <w:b/>
+        </w:rPr>
+        <w:t xml:space="preserve">33. </w:t>
+      </w:r>
+      <w:r>
+        <w:t>Na sua percepção, o que é registrado sobre educação digital corresponde ao que de fato acontece com as crianças?</w:t>
+      </w:r>
+    </w:p>
+    <w:p>
+      <w:pPr>
+        <w:spacing w:after="0"/>
+        <w:ind w:left="425"/>
+      </w:pPr>
+      <w:r>
+        <w:t>( ) Corresponde plenamente</w:t>
+      </w:r>
+    </w:p>
+    <w:p>
+      <w:pPr>
+        <w:spacing w:after="0"/>
+        <w:ind w:left="425"/>
+      </w:pPr>
+      <w:r>
+        <w:t>( ) Corresponde em parte</w:t>
+      </w:r>
+    </w:p>
+    <w:p>
+      <w:pPr>
+        <w:spacing w:after="0"/>
+        <w:ind w:left="425"/>
+      </w:pPr>
+      <w:r>
+        <w:t>( ) Corresponde pouco</w:t>
+      </w:r>
+    </w:p>
+    <w:p>
+      <w:pPr>
+        <w:spacing w:after="0"/>
+        <w:ind w:left="425"/>
+      </w:pPr>
+      <w:r>
+        <w:t>( ) Não sei avaliar</w:t>
+      </w:r>
+    </w:p>
+    <w:p>
+      <w:pPr>
+        <w:spacing w:before="120" w:after="40"/>
+      </w:pPr>
+      <w:r>
+        <w:rPr>
+          <w:b/>
+        </w:rPr>
+        <w:t xml:space="preserve">34. </w:t>
+      </w:r>
+      <w:r>
+        <w:t>O texto da PNED considera as condições materiais das escolas municipais?</w:t>
+      </w:r>
+    </w:p>
+    <w:p>
+      <w:pPr>
+        <w:spacing w:after="0"/>
+        <w:ind w:left="425"/>
+      </w:pPr>
+      <w:r>
+        <w:t>( ) Considera plenamente</w:t>
+      </w:r>
+    </w:p>
+    <w:p>
+      <w:pPr>
+        <w:spacing w:after="0"/>
+        <w:ind w:left="425"/>
+      </w:pPr>
+      <w:r>
+        <w:t>( ) Considera em parte, com exigências distantes da escola</w:t>
+      </w:r>
+    </w:p>
+    <w:p>
+      <w:pPr>
+        <w:spacing w:after="0"/>
+        <w:ind w:left="425"/>
+      </w:pPr>
+      <w:r>
+        <w:t>( ) Não considera</w:t>
+      </w:r>
+    </w:p>
+    <w:p>
+      <w:pPr>
+        <w:spacing w:after="0"/>
+        <w:ind w:left="425"/>
+      </w:pPr>
+      <w:r>
+        <w:t>( ) Não sei opinar</w:t>
+      </w:r>
+    </w:p>
+    <w:p>
+      <w:pPr>
+        <w:spacing w:before="240" w:after="120"/>
+      </w:pPr>
+      <w:r>
+        <w:rPr>
+          <w:b/>
+        </w:rPr>
+        <w:t>BLOCO 5 – CONCEPÇÕES DE EDUCAÇÃO DIGITAL E DIREITOS DA CRIANÇA</w:t>
+      </w:r>
+    </w:p>
+    <w:p>
+      <w:pPr>
+        <w:spacing w:before="120" w:after="40"/>
+      </w:pPr>
+      <w:r>
+        <w:rPr>
+          <w:b/>
+        </w:rPr>
+        <w:t xml:space="preserve">35. </w:t>
+      </w:r>
+      <w:r>
+        <w:t>Quando você pensa em “educação digital” nos anos iniciais, o que vem primeiro? (Assinale até duas)</w:t>
+      </w:r>
+    </w:p>
+    <w:p>
+      <w:pPr>
+        <w:spacing w:after="0"/>
+        <w:ind w:left="425"/>
+      </w:pPr>
+      <w:r>
+        <w:t>[ ] Usar equipamentos e aplicativos nas aulas</w:t>
+      </w:r>
+    </w:p>
+    <w:p>
+      <w:pPr>
+        <w:spacing w:after="0"/>
+        <w:ind w:left="425"/>
+      </w:pPr>
+      <w:r>
+        <w:t>[ ] Ensinar como a internet e os dispositivos funcionam</w:t>
+      </w:r>
+    </w:p>
+    <w:p>
+      <w:pPr>
+        <w:spacing w:after="0"/>
+        <w:ind w:left="425"/>
+      </w:pPr>
+      <w:r>
+        <w:t>[ ] Desenvolver leitura crítica do que as crianças veem nas telas</w:t>
+      </w:r>
+    </w:p>
+    <w:p>
+      <w:pPr>
+        <w:spacing w:after="0"/>
+        <w:ind w:left="425"/>
+      </w:pPr>
+      <w:r>
+        <w:t>[ ] Proteger as crianças de riscos, publicidade e exposição de dados</w:t>
+      </w:r>
+    </w:p>
+    <w:p>
+      <w:pPr>
+        <w:spacing w:after="0"/>
+        <w:ind w:left="425"/>
+      </w:pPr>
+      <w:r>
+        <w:t>[ ] Garantir que todas as crianças tenham acesso</w:t>
+      </w:r>
+    </w:p>
+    <w:p>
+      <w:pPr>
+        <w:spacing w:after="0"/>
+        <w:ind w:left="425"/>
+      </w:pPr>
+      <w:r>
+        <w:t>[ ] Permitir que as crianças produzam e se expressem com o digital</w:t>
+      </w:r>
+    </w:p>
+    <w:p>
+      <w:pPr>
+        <w:spacing w:before="120" w:after="40"/>
+      </w:pPr>
+      <w:r>
+        <w:rPr>
+          <w:b/>
+        </w:rPr>
+        <w:t xml:space="preserve">36. </w:t>
+      </w:r>
+      <w:r>
+        <w:t>As crianças chegam à escola com experiências desiguais com celulares, computadores e internet?</w:t>
+      </w:r>
+    </w:p>
+    <w:p>
+      <w:pPr>
+        <w:spacing w:after="0"/>
+        <w:ind w:left="425"/>
+      </w:pPr>
+      <w:r>
+        <w:t>( ) Sim, com contrastes profundos</w:t>
+      </w:r>
+    </w:p>
+    <w:p>
+      <w:pPr>
+        <w:spacing w:after="0"/>
+        <w:ind w:left="425"/>
+      </w:pPr>
+      <w:r>
+        <w:t>( ) Sim, mas sem grande efeito na rotina</w:t>
+      </w:r>
+    </w:p>
+    <w:p>
+      <w:pPr>
+        <w:spacing w:after="0"/>
+        <w:ind w:left="425"/>
+      </w:pPr>
+      <w:r>
+        <w:t>( ) Não</w:t>
+      </w:r>
+    </w:p>
+    <w:p>
+      <w:pPr>
+        <w:spacing w:after="0"/>
+        <w:ind w:left="425"/>
+      </w:pPr>
+      <w:r>
+        <w:t>( ) Não sei informar</w:t>
+      </w:r>
+    </w:p>
+    <w:p>
+      <w:pPr>
+        <w:spacing w:before="120" w:after="40"/>
+      </w:pPr>
+      <w:r>
+        <w:rPr>
+          <w:b/>
+        </w:rPr>
+        <w:t xml:space="preserve">37. </w:t>
+      </w:r>
+      <w:r>
+        <w:t>Na sua escola, qual destes direitos das crianças no ambiente digital parece mais distante de ser garantido?</w:t>
+      </w:r>
+    </w:p>
+    <w:p>
+      <w:pPr>
+        <w:spacing w:after="0"/>
+        <w:ind w:left="425"/>
+      </w:pPr>
+      <w:r>
+        <w:t>( ) Acesso a equipamentos e conexão de qualidade (provisão)</w:t>
+      </w:r>
+    </w:p>
+    <w:p>
+      <w:pPr>
+        <w:spacing w:after="0"/>
+        <w:ind w:left="425"/>
+      </w:pPr>
+      <w:r>
+        <w:t>( ) Aprender a usar o digital com autonomia e senso crítico (participação)</w:t>
+      </w:r>
+    </w:p>
+    <w:p>
+      <w:pPr>
+        <w:spacing w:after="0"/>
+        <w:ind w:left="425"/>
+      </w:pPr>
+      <w:r>
+        <w:t>( ) Proteção da privacidade, da imagem e dos dados (proteção)</w:t>
+      </w:r>
+    </w:p>
+    <w:p>
+      <w:pPr>
+        <w:spacing w:after="0"/>
+        <w:ind w:left="425"/>
+      </w:pPr>
+      <w:r>
+        <w:t>( ) Não sei avaliar</w:t>
+      </w:r>
+    </w:p>
+    <w:p>
+      <w:pPr>
+        <w:spacing w:before="120" w:after="40"/>
+      </w:pPr>
+      <w:r>
+        <w:rPr>
+          <w:b/>
+        </w:rPr>
+        <w:t xml:space="preserve">38. </w:t>
+      </w:r>
+      <w:r>
+        <w:t>Quais são os principais desafios para a educação digital na sua escola? (Assinale até três)</w:t>
+      </w:r>
+    </w:p>
+    <w:p>
+      <w:pPr>
+        <w:spacing w:after="0"/>
+        <w:ind w:left="425"/>
+      </w:pPr>
+      <w:r>
+        <w:t>[ ] Formação continuada voltada à infância</w:t>
+      </w:r>
+    </w:p>
+    <w:p>
+      <w:pPr>
+        <w:spacing w:after="0"/>
+        <w:ind w:left="425"/>
+      </w:pPr>
+      <w:r>
+        <w:t>[ ] Internet instável ou ausente nas salas</w:t>
+      </w:r>
+    </w:p>
+    <w:p>
+      <w:pPr>
+        <w:spacing w:after="0"/>
+        <w:ind w:left="425"/>
+      </w:pPr>
+      <w:r>
+        <w:t>[ ] Equipamentos insuficientes ou obsoletos</w:t>
+      </w:r>
+    </w:p>
+    <w:p>
+      <w:pPr>
+        <w:spacing w:after="0"/>
+        <w:ind w:left="425"/>
+      </w:pPr>
+      <w:r>
+        <w:t>[ ] Pouco tempo de planejamento</w:t>
+      </w:r>
+    </w:p>
+    <w:p>
+      <w:pPr>
+        <w:spacing w:after="0"/>
+        <w:ind w:left="425"/>
+      </w:pPr>
+      <w:r>
+        <w:t>[ ] Falta de suporte técnico</w:t>
+      </w:r>
+    </w:p>
+    <w:p>
+      <w:pPr>
+        <w:spacing w:after="0"/>
+        <w:ind w:left="425"/>
+      </w:pPr>
+      <w:r>
+        <w:t>[ ] Orientações curriculares pouco claras</w:t>
+      </w:r>
+    </w:p>
+    <w:p>
+      <w:pPr>
+        <w:spacing w:after="0"/>
+        <w:ind w:left="425"/>
+      </w:pPr>
+      <w:r>
+        <w:t>[ ] Excesso de registros e exigências burocráticas</w:t>
+      </w:r>
+    </w:p>
+    <w:p>
+      <w:pPr>
+        <w:spacing w:after="0"/>
+        <w:ind w:left="425"/>
+      </w:pPr>
+      <w:r>
+        <w:t>[ ] Outro: ______________</w:t>
+      </w:r>
+    </w:p>
+    <w:p>
+      <w:pPr>
+        <w:spacing w:before="240" w:after="120"/>
+      </w:pPr>
+      <w:r>
+        <w:rPr>
+          <w:b/>
+        </w:rPr>
+        <w:t>BLOCO 6 – QUESTÃO ABERTA</w:t>
+      </w:r>
+    </w:p>
+    <w:p>
+      <w:pPr>
+        <w:spacing w:before="120" w:after="40"/>
+      </w:pPr>
+      <w:r>
+        <w:rPr>
+          <w:b/>
+        </w:rPr>
+        <w:t xml:space="preserve">39. </w:t>
+      </w:r>
+      <w:r>
+        <w:t>Se desejar, registre comentários sobre a PNED, a realidade da escola ou as condições de trabalho com a cultura digital.</w:t>
+      </w:r>
+    </w:p>
+    <w:p>
+      <w:pPr>
+        <w:spacing w:after="0"/>
+      </w:pPr>
+      <w:r>
+        <w:t>______________________________________________________________________________</w:t>
+      </w:r>
+    </w:p>
+    <w:p>
+      <w:pPr>
+        <w:spacing w:after="0"/>
+      </w:pPr>
+      <w:r>
+        <w:t>______________________________________________________________________________</w:t>
+      </w:r>
+    </w:p>
+    <w:p>
+      <w:pPr>
+        <w:spacing w:after="0"/>
+      </w:pPr>
+      <w:r>
+        <w:t>______________________________________________________________________________</w:t>
+      </w:r>
+    </w:p>
+    <w:p>
+      <w:pPr>
+        <w:spacing w:after="80"/>
+        <w:jc w:val="both"/>
+      </w:pPr>
+      <w:r>
+        <w:rPr>
+          <w:sz w:val="22"/>
+        </w:rPr>
+        <w:t>Nota metodológica: os Blocos 1 e 2 alimentam a leitura da dimensão das culturas profissionais; o Bloco 3, as dimensões material e situacional; o Bloco 4, a dimensão externa e as primeiras pistas sobre performatividade; o Bloco 5, a noção de habitar o digital e a leitura pelos direitos da criança (provisão, participação e proteção). As respostas indicam pontos a aprofundar individualmente nas entrevistas e não serão tratadas como constatação isolada.</w:t>
+      </w:r>
+    </w:p>
+    <w:p>
+      <w:r>
+        <w:br w:type="page"/>
+      </w:r>
+    </w:p>
+    <w:p>
+      <w:pPr>
+        <w:spacing w:after="240"/>
+        <w:jc w:val="center"/>
+      </w:pPr>
+      <w:r>
+        <w:rPr>
+          <w:b/>
+        </w:rPr>
+        <w:t>APÊNDICE B – ROTEIRO DE ENTREVISTA SEMIESTRUTURADA EM PROFUNDIDADE</w:t>
+      </w:r>
+    </w:p>
+    <w:p>
+      <w:pPr>
+        <w:spacing w:after="120"/>
+        <w:jc w:val="both"/>
+      </w:pPr>
+      <w:r>
+        <w:rPr>
+          <w:b/>
+        </w:rPr>
+        <w:t xml:space="preserve">Pesquisa: </w:t>
+      </w:r>
+      <w:r>
+        <w:t>A encenação da Política Nacional de Educação Digital (PNED) em Pipa/RN: culturas profissionais, território e resistências no contexto da prática.</w:t>
+      </w:r>
+    </w:p>
+    <w:p>
+      <w:pPr>
+        <w:spacing w:after="120"/>
+        <w:jc w:val="both"/>
+      </w:pPr>
+      <w:r>
+        <w:rPr>
+          <w:b/>
+        </w:rPr>
+        <w:t xml:space="preserve">Objetivo do instrumento: </w:t>
+      </w:r>
+      <w:r>
+        <w:t>escutar como os profissionais da educação interpretam a PNED, que táticas constroem para traduzi-la nas condições materiais e territoriais da escola e como respondem às exigências de registro e de resultado, identificando movimentos de ressignificação e de resistência.</w:t>
+      </w:r>
+    </w:p>
+    <w:p>
+      <w:pPr>
+        <w:spacing w:after="120"/>
+        <w:jc w:val="both"/>
+      </w:pPr>
+      <w:r>
+        <w:rPr>
+          <w:b/>
+        </w:rPr>
+        <w:t xml:space="preserve">Modalidade: </w:t>
+      </w:r>
+      <w:r>
+        <w:t>entrevista semiestruturada em profundidade, conduzida como narrativa, com duração prevista entre 60 e 90 minutos.</w:t>
+      </w:r>
+    </w:p>
+    <w:p>
+      <w:pPr>
+        <w:spacing w:after="120"/>
+        <w:jc w:val="both"/>
+      </w:pPr>
+      <w:r>
+        <w:rPr>
+          <w:b/>
+        </w:rPr>
+        <w:t xml:space="preserve">Cuidados éticos: </w:t>
+      </w:r>
+      <w:r>
+        <w:t>realização individual, em espaço reservado, com gravação em áudio autorizada no TCLE, transcrição integral e identificação por pseudônimo (Resoluções CNS nº 466/2012 e nº 510/2016).</w:t>
+      </w:r>
+    </w:p>
+    <w:p>
+      <w:pPr>
+        <w:spacing w:before="240" w:after="120"/>
+      </w:pPr>
+      <w:r>
+        <w:rPr>
+          <w:b/>
+        </w:rPr>
+        <w:t>PARTE 1 – ROTEIRO BASE (DOCÊNCIA NOS ANOS INICIAIS)</w:t>
+      </w:r>
+    </w:p>
+    <w:p>
+      <w:pPr>
+        <w:spacing w:before="240" w:after="120"/>
+      </w:pPr>
+      <w:r>
+        <w:rPr>
+          <w:b/>
+        </w:rPr>
+        <w:t>EIXO 1 – Trajetória e culturas profissionais</w:t>
+      </w:r>
+    </w:p>
+    <w:p>
+      <w:pPr>
+        <w:jc w:val="both"/>
+      </w:pPr>
+      <w:r>
+        <w:rPr>
+          <w:b/>
+          <w:i/>
+        </w:rPr>
+        <w:t xml:space="preserve">Questão norteadora: </w:t>
+      </w:r>
+      <w:r>
+        <w:rPr>
+          <w:i/>
+        </w:rPr>
+        <w:t>como a sua história na profissão e na escola orienta a sua relação com o digital?</w:t>
+      </w:r>
+    </w:p>
+    <w:p>
+      <w:pPr>
+        <w:spacing w:after="80"/>
+        <w:ind w:left="425" w:hanging="425"/>
+        <w:jc w:val="both"/>
+      </w:pPr>
+      <w:r>
+        <w:rPr>
+          <w:b/>
+        </w:rPr>
+        <w:t>1.</w:t>
+        <w:tab/>
+      </w:r>
+      <w:r>
+        <w:t>Conte um pouco da sua trajetória na educação e de como chegou à Escola Municipal Domitila Castelo.</w:t>
+      </w:r>
+    </w:p>
+    <w:p>
+      <w:pPr>
+        <w:spacing w:after="80"/>
+        <w:ind w:left="425" w:hanging="425"/>
+        <w:jc w:val="both"/>
+      </w:pPr>
+      <w:r>
+        <w:rPr>
+          <w:b/>
+        </w:rPr>
+        <w:t>2.</w:t>
+        <w:tab/>
+      </w:r>
+      <w:r>
+        <w:t>Como é trabalhar nesta escola? O que a equipe valoriza e o que costuma ser considerado um bom trabalho aqui?</w:t>
+      </w:r>
+    </w:p>
+    <w:p>
+      <w:pPr>
+        <w:spacing w:after="80"/>
+        <w:ind w:left="425" w:hanging="425"/>
+        <w:jc w:val="both"/>
+      </w:pPr>
+      <w:r>
+        <w:rPr>
+          <w:b/>
+        </w:rPr>
+        <w:t>3.</w:t>
+        <w:tab/>
+      </w:r>
+      <w:r>
+        <w:t>Como as tecnologias digitais apareceram na sua formação, inicial e continuada, e o que delas você leva para a sala de aula?</w:t>
+      </w:r>
+    </w:p>
+    <w:p>
+      <w:pPr>
+        <w:spacing w:after="80"/>
+        <w:ind w:left="425" w:hanging="425"/>
+        <w:jc w:val="both"/>
+      </w:pPr>
+      <w:r>
+        <w:rPr>
+          <w:b/>
+        </w:rPr>
+        <w:t>4.</w:t>
+        <w:tab/>
+      </w:r>
+      <w:r>
+        <w:t>Quando você precisa aprender uma ferramenta ou um conteúdo novo para o trabalho, com quem e como isso costuma acontecer?</w:t>
+      </w:r>
+    </w:p>
+    <w:p>
+      <w:pPr>
+        <w:spacing w:before="240" w:after="120"/>
+      </w:pPr>
+      <w:r>
+        <w:rPr>
+          <w:b/>
+        </w:rPr>
+        <w:t>EIXO 2 – Interpretação: como a PNED chegou e o que se entende dela</w:t>
+      </w:r>
+    </w:p>
+    <w:p>
+      <w:pPr>
+        <w:jc w:val="both"/>
+      </w:pPr>
+      <w:r>
+        <w:rPr>
+          <w:b/>
+          <w:i/>
+        </w:rPr>
+        <w:t xml:space="preserve">Questão norteadora: </w:t>
+      </w:r>
+      <w:r>
+        <w:rPr>
+          <w:i/>
+        </w:rPr>
+        <w:t>que sentidos você atribui à PNED e à educação digital?</w:t>
+      </w:r>
+    </w:p>
+    <w:p>
+      <w:pPr>
+        <w:spacing w:after="80"/>
+        <w:ind w:left="425" w:hanging="425"/>
+        <w:jc w:val="both"/>
+      </w:pPr>
+      <w:r>
+        <w:rPr>
+          <w:b/>
+        </w:rPr>
+        <w:t>5.</w:t>
+        <w:tab/>
+      </w:r>
+      <w:r>
+        <w:t>O que você conhece da Política Nacional de Educação Digital? Por quais caminhos ela chegou até você?</w:t>
+      </w:r>
+    </w:p>
+    <w:p>
+      <w:pPr>
+        <w:spacing w:after="80"/>
+        <w:ind w:left="425" w:hanging="425"/>
+        <w:jc w:val="both"/>
+      </w:pPr>
+      <w:r>
+        <w:rPr>
+          <w:b/>
+        </w:rPr>
+        <w:t>6.</w:t>
+        <w:tab/>
+      </w:r>
+      <w:r>
+        <w:t>Houve reuniões, documentos ou formações da escola ou da Secretaria sobre a PNED? Como foram?</w:t>
+      </w:r>
+    </w:p>
+    <w:p>
+      <w:pPr>
+        <w:spacing w:after="80"/>
+        <w:ind w:left="425" w:hanging="425"/>
+        <w:jc w:val="both"/>
+      </w:pPr>
+      <w:r>
+        <w:rPr>
+          <w:b/>
+        </w:rPr>
+        <w:t>7.</w:t>
+        <w:tab/>
+      </w:r>
+      <w:r>
+        <w:t>Para você, o que é educação digital com crianças pequenas? Poderia dar um exemplo do que, na sua visão, seria um bom trabalho nessa área?</w:t>
+      </w:r>
+    </w:p>
+    <w:p>
+      <w:pPr>
+        <w:spacing w:after="80"/>
+        <w:ind w:left="425" w:hanging="425"/>
+        <w:jc w:val="both"/>
+      </w:pPr>
+      <w:r>
+        <w:rPr>
+          <w:b/>
+        </w:rPr>
+        <w:t>8.</w:t>
+        <w:tab/>
+      </w:r>
+      <w:r>
+        <w:t>Na sua leitura, o que a política espera de quem trabalha nos anos iniciais? Você vê essas expectativas como próximas ou distantes da sua realidade? Por quê?</w:t>
+      </w:r>
+    </w:p>
+    <w:p>
+      <w:pPr>
+        <w:spacing w:after="80"/>
+        <w:ind w:left="425" w:hanging="425"/>
+        <w:jc w:val="both"/>
+      </w:pPr>
+      <w:r>
+        <w:rPr>
+          <w:b/>
+        </w:rPr>
+        <w:t>9.</w:t>
+        <w:tab/>
+      </w:r>
+      <w:r>
+        <w:t>Há algo no que a política propõe com que você concorda muito ou de que discorda? O quê?</w:t>
+      </w:r>
+    </w:p>
+    <w:p>
+      <w:pPr>
+        <w:spacing w:before="240" w:after="120"/>
+      </w:pPr>
+      <w:r>
+        <w:rPr>
+          <w:b/>
+        </w:rPr>
+        <w:t>EIXO 3 – Tradução: o cotidiano, a dimensão material e o território</w:t>
+      </w:r>
+    </w:p>
+    <w:p>
+      <w:pPr>
+        <w:jc w:val="both"/>
+      </w:pPr>
+      <w:r>
+        <w:rPr>
+          <w:b/>
+          <w:i/>
+        </w:rPr>
+        <w:t xml:space="preserve">Questão norteadora: </w:t>
+      </w:r>
+      <w:r>
+        <w:rPr>
+          <w:i/>
+        </w:rPr>
+        <w:t>como a educação digital acontece na rotina, diante das condições da escola e de Pipa?</w:t>
+      </w:r>
+    </w:p>
+    <w:p>
+      <w:pPr>
+        <w:spacing w:after="80"/>
+        <w:ind w:left="425" w:hanging="425"/>
+        <w:jc w:val="both"/>
+      </w:pPr>
+      <w:r>
+        <w:rPr>
+          <w:b/>
+        </w:rPr>
+        <w:t>10.</w:t>
+        <w:tab/>
+      </w:r>
+      <w:r>
+        <w:t>Como o digital está presente nas suas aulas? Que recursos você usa com mais frequência?</w:t>
+      </w:r>
+    </w:p>
+    <w:p>
+      <w:pPr>
+        <w:spacing w:after="80"/>
+        <w:ind w:left="425" w:hanging="425"/>
+        <w:jc w:val="both"/>
+      </w:pPr>
+      <w:r>
+        <w:rPr>
+          <w:b/>
+        </w:rPr>
+        <w:t>11.</w:t>
+        <w:tab/>
+      </w:r>
+      <w:r>
+        <w:t>Descreva uma atividade com recursos digitais que você planejou e conseguiu realizar. O que a tornou possível?</w:t>
+      </w:r>
+    </w:p>
+    <w:p>
+      <w:pPr>
+        <w:spacing w:after="80"/>
+        <w:ind w:left="425" w:hanging="425"/>
+        <w:jc w:val="both"/>
+      </w:pPr>
+      <w:r>
+        <w:rPr>
+          <w:b/>
+        </w:rPr>
+        <w:t>12.</w:t>
+        <w:tab/>
+      </w:r>
+      <w:r>
+        <w:t>Agora, uma atividade que você planejou e não conseguiu realizar como pretendia. O que aconteceu?</w:t>
+      </w:r>
+    </w:p>
+    <w:p>
+      <w:pPr>
+        <w:spacing w:after="80"/>
+        <w:ind w:left="425" w:hanging="425"/>
+        <w:jc w:val="both"/>
+      </w:pPr>
+      <w:r>
+        <w:rPr>
+          <w:b/>
+        </w:rPr>
+        <w:t>13.</w:t>
+        <w:tab/>
+      </w:r>
+      <w:r>
+        <w:t>Como funcionam, no dia a dia, a internet, o laboratório e os equipamentos? Quando mais de uma turma precisa do mesmo recurso, como se decide quem usa?</w:t>
+      </w:r>
+    </w:p>
+    <w:p>
+      <w:pPr>
+        <w:spacing w:after="80"/>
+        <w:ind w:left="425" w:hanging="425"/>
+        <w:jc w:val="both"/>
+      </w:pPr>
+      <w:r>
+        <w:rPr>
+          <w:b/>
+        </w:rPr>
+        <w:t>14.</w:t>
+        <w:tab/>
+      </w:r>
+      <w:r>
+        <w:t>Quando chega uma orientação sobre tecnologia, o que você precisa escolher, adaptar ou deixar de lado para que o trabalho funcione com a sua turma?</w:t>
+      </w:r>
+    </w:p>
+    <w:p>
+      <w:pPr>
+        <w:spacing w:after="80"/>
+        <w:ind w:left="425" w:hanging="425"/>
+        <w:jc w:val="both"/>
+      </w:pPr>
+      <w:r>
+        <w:rPr>
+          <w:b/>
+        </w:rPr>
+        <w:t>15.</w:t>
+        <w:tab/>
+      </w:r>
+      <w:r>
+        <w:t>Quando falta algo necessário para uma atividade, o que você faz? Já recorreu a algo seu, como celular, pacote de dados ou material comprado? Em que momento do dia ou da semana faz esse trabalho?</w:t>
+      </w:r>
+    </w:p>
+    <w:p>
+      <w:pPr>
+        <w:spacing w:after="80"/>
+        <w:ind w:left="425" w:hanging="425"/>
+        <w:jc w:val="both"/>
+      </w:pPr>
+      <w:r>
+        <w:rPr>
+          <w:b/>
+        </w:rPr>
+        <w:t>16.</w:t>
+        <w:tab/>
+      </w:r>
+      <w:r>
+        <w:t>Como você entende essas decisões: como parte do trabalho, como escolha pessoal ou como algo que não deveria ser necessário?</w:t>
+      </w:r>
+    </w:p>
+    <w:p>
+      <w:pPr>
+        <w:spacing w:after="80"/>
+        <w:ind w:left="425" w:hanging="425"/>
+        <w:jc w:val="both"/>
+      </w:pPr>
+      <w:r>
+        <w:rPr>
+          <w:b/>
+        </w:rPr>
+        <w:t>17.</w:t>
+        <w:tab/>
+      </w:r>
+      <w:r>
+        <w:t>Pipa é, ao mesmo tempo, destino turístico conectado e lugar de comunidades com pouco acesso. Como essa convivência aparece na escola e nas experiências das crianças com o digital?</w:t>
+      </w:r>
+    </w:p>
+    <w:p>
+      <w:pPr>
+        <w:spacing w:after="80"/>
+        <w:ind w:left="425" w:hanging="425"/>
+        <w:jc w:val="both"/>
+      </w:pPr>
+      <w:r>
+        <w:rPr>
+          <w:b/>
+        </w:rPr>
+        <w:t>18.</w:t>
+        <w:tab/>
+      </w:r>
+      <w:r>
+        <w:t>Morar ou conviver com as famílias no distrito pesa, de alguma forma, no que você decide fazer ou deixar de fazer em relação ao digital?</w:t>
+      </w:r>
+    </w:p>
+    <w:p>
+      <w:pPr>
+        <w:spacing w:before="240" w:after="120"/>
+      </w:pPr>
+      <w:r>
+        <w:rPr>
+          <w:b/>
+        </w:rPr>
+        <w:t>EIXO 4 – Performatividade: registros, metas e cobranças</w:t>
+      </w:r>
+    </w:p>
+    <w:p>
+      <w:pPr>
+        <w:jc w:val="both"/>
+      </w:pPr>
+      <w:r>
+        <w:rPr>
+          <w:b/>
+          <w:i/>
+        </w:rPr>
+        <w:t xml:space="preserve">Questão norteadora: </w:t>
+      </w:r>
+      <w:r>
+        <w:rPr>
+          <w:i/>
+        </w:rPr>
+        <w:t>que exigências acompanham a educação digital e como elas afetam o seu trabalho?</w:t>
+      </w:r>
+    </w:p>
+    <w:p>
+      <w:pPr>
+        <w:spacing w:after="80"/>
+        <w:ind w:left="425" w:hanging="425"/>
+        <w:jc w:val="both"/>
+      </w:pPr>
+      <w:r>
+        <w:rPr>
+          <w:b/>
+        </w:rPr>
+        <w:t>19.</w:t>
+        <w:tab/>
+      </w:r>
+      <w:r>
+        <w:t>O trabalho com educação digital precisa ser registrado ou comprovado de alguma forma (planejamentos, fotografias, relatórios, sistemas, plataformas)? Como isso funciona?</w:t>
+      </w:r>
+    </w:p>
+    <w:p>
+      <w:pPr>
+        <w:spacing w:after="80"/>
+        <w:ind w:left="425" w:hanging="425"/>
+        <w:jc w:val="both"/>
+      </w:pPr>
+      <w:r>
+        <w:rPr>
+          <w:b/>
+        </w:rPr>
+        <w:t>20.</w:t>
+        <w:tab/>
+      </w:r>
+      <w:r>
+        <w:t>Quem pede esses registros e para que eles servem, na sua percepção?</w:t>
+      </w:r>
+    </w:p>
+    <w:p>
+      <w:pPr>
+        <w:spacing w:after="80"/>
+        <w:ind w:left="425" w:hanging="425"/>
+        <w:jc w:val="both"/>
+      </w:pPr>
+      <w:r>
+        <w:rPr>
+          <w:b/>
+        </w:rPr>
+        <w:t>21.</w:t>
+        <w:tab/>
+      </w:r>
+      <w:r>
+        <w:t>Já sentiu que precisava mostrar resultados ou evidências que não traduziam bem o que aconteceu de fato com as crianças? Como lidou com isso?</w:t>
+      </w:r>
+    </w:p>
+    <w:p>
+      <w:pPr>
+        <w:spacing w:after="80"/>
+        <w:ind w:left="425" w:hanging="425"/>
+        <w:jc w:val="both"/>
+      </w:pPr>
+      <w:r>
+        <w:rPr>
+          <w:b/>
+        </w:rPr>
+        <w:t>22.</w:t>
+        <w:tab/>
+      </w:r>
+      <w:r>
+        <w:t>Avaliações, plataformas ou programas externos influenciam o que se faz com as crianças em relação ao digital? De que modo?</w:t>
+      </w:r>
+    </w:p>
+    <w:p>
+      <w:pPr>
+        <w:spacing w:after="80"/>
+        <w:ind w:left="425" w:hanging="425"/>
+        <w:jc w:val="both"/>
+      </w:pPr>
+      <w:r>
+        <w:rPr>
+          <w:b/>
+        </w:rPr>
+        <w:t>23.</w:t>
+        <w:tab/>
+      </w:r>
+      <w:r>
+        <w:t>Essas exigências mudam a forma como você se vê como profissional ou o modo como organiza o seu tempo? Pode dar um exemplo?</w:t>
+      </w:r>
+    </w:p>
+    <w:p>
+      <w:pPr>
+        <w:spacing w:before="240" w:after="120"/>
+      </w:pPr>
+      <w:r>
+        <w:rPr>
+          <w:b/>
+        </w:rPr>
+        <w:t>EIXO 5 – Ressignificação e resistência</w:t>
+      </w:r>
+    </w:p>
+    <w:p>
+      <w:pPr>
+        <w:jc w:val="both"/>
+      </w:pPr>
+      <w:r>
+        <w:rPr>
+          <w:b/>
+          <w:i/>
+        </w:rPr>
+        <w:t xml:space="preserve">Questão norteadora: </w:t>
+      </w:r>
+      <w:r>
+        <w:rPr>
+          <w:i/>
+        </w:rPr>
+        <w:t>como você e a equipe respondem ao que a política pede quando ele não cabe na realidade da escola?</w:t>
+      </w:r>
+    </w:p>
+    <w:p>
+      <w:pPr>
+        <w:spacing w:after="80"/>
+        <w:ind w:left="425" w:hanging="425"/>
+        <w:jc w:val="both"/>
+      </w:pPr>
+      <w:r>
+        <w:rPr>
+          <w:b/>
+        </w:rPr>
+        <w:t>24.</w:t>
+        <w:tab/>
+      </w:r>
+      <w:r>
+        <w:t>Existem coisas que a política ou a rede pede e que, na prática, a escola não consegue fazer? O que acontece com essas exigências?</w:t>
+      </w:r>
+    </w:p>
+    <w:p>
+      <w:pPr>
+        <w:spacing w:after="80"/>
+        <w:ind w:left="425" w:hanging="425"/>
+        <w:jc w:val="both"/>
+      </w:pPr>
+      <w:r>
+        <w:rPr>
+          <w:b/>
+        </w:rPr>
+        <w:t>25.</w:t>
+        <w:tab/>
+      </w:r>
+      <w:r>
+        <w:t>Há situações em que você decide não realizar uma atividade digital? O que pesa nessa decisão?</w:t>
+      </w:r>
+    </w:p>
+    <w:p>
+      <w:pPr>
+        <w:spacing w:after="80"/>
+        <w:ind w:left="425" w:hanging="425"/>
+        <w:jc w:val="both"/>
+      </w:pPr>
+      <w:r>
+        <w:rPr>
+          <w:b/>
+        </w:rPr>
+        <w:t>26.</w:t>
+        <w:tab/>
+      </w:r>
+      <w:r>
+        <w:t>Você ou a equipe já transformaram uma orientação oficial em algo diferente, mais adequado às crianças e à comunidade? Conte como foi.</w:t>
+      </w:r>
+    </w:p>
+    <w:p>
+      <w:pPr>
+        <w:spacing w:after="80"/>
+        <w:ind w:left="425" w:hanging="425"/>
+        <w:jc w:val="both"/>
+      </w:pPr>
+      <w:r>
+        <w:rPr>
+          <w:b/>
+        </w:rPr>
+        <w:t>27.</w:t>
+        <w:tab/>
+      </w:r>
+      <w:r>
+        <w:t>Quando o que é pedido entra em conflito com o que você acredita ser melhor para as crianças, como você age? Isso é conversado com a equipe?</w:t>
+      </w:r>
+    </w:p>
+    <w:p>
+      <w:pPr>
+        <w:spacing w:before="240" w:after="120"/>
+      </w:pPr>
+      <w:r>
+        <w:rPr>
+          <w:b/>
+        </w:rPr>
+        <w:t>EIXO 6 – Habitar o digital e direitos da criança</w:t>
+      </w:r>
+    </w:p>
+    <w:p>
+      <w:pPr>
+        <w:jc w:val="both"/>
+      </w:pPr>
+      <w:r>
+        <w:rPr>
+          <w:b/>
+          <w:i/>
+        </w:rPr>
+        <w:t xml:space="preserve">Questão norteadora: </w:t>
+      </w:r>
+      <w:r>
+        <w:rPr>
+          <w:i/>
+        </w:rPr>
+        <w:t>que lugar o digital ocupa na vida das crianças e o que a escola deve garantir a elas?</w:t>
+      </w:r>
+    </w:p>
+    <w:p>
+      <w:pPr>
+        <w:spacing w:after="80"/>
+        <w:ind w:left="425" w:hanging="425"/>
+        <w:jc w:val="both"/>
+      </w:pPr>
+      <w:r>
+        <w:rPr>
+          <w:b/>
+        </w:rPr>
+        <w:t>28.</w:t>
+        <w:tab/>
+      </w:r>
+      <w:r>
+        <w:t>Como as crianças da sua turma se relacionam com celulares, jogos, vídeos e redes sociais fora da escola? Que diferenças você percebe entre elas?</w:t>
+      </w:r>
+    </w:p>
+    <w:p>
+      <w:pPr>
+        <w:spacing w:after="80"/>
+        <w:ind w:left="425" w:hanging="425"/>
+        <w:jc w:val="both"/>
+      </w:pPr>
+      <w:r>
+        <w:rPr>
+          <w:b/>
+        </w:rPr>
+        <w:t>29.</w:t>
+        <w:tab/>
+      </w:r>
+      <w:r>
+        <w:t>A escola deve priorizar o manuseio de ferramentas ou a capacidade de questionar o que as crianças veem nas telas? Como você equilibra isso?</w:t>
+      </w:r>
+    </w:p>
+    <w:p>
+      <w:pPr>
+        <w:spacing w:after="80"/>
+        <w:ind w:left="425" w:hanging="425"/>
+        <w:jc w:val="both"/>
+      </w:pPr>
+      <w:r>
+        <w:rPr>
+          <w:b/>
+        </w:rPr>
+        <w:t>30.</w:t>
+        <w:tab/>
+      </w:r>
+      <w:r>
+        <w:t>Aparecem na escola situações de exposição às telas, publicidade, uso de imagem ou de dados das crianças? Como são percebidas e enfrentadas?</w:t>
+      </w:r>
+    </w:p>
+    <w:p>
+      <w:pPr>
+        <w:spacing w:after="80"/>
+        <w:ind w:left="425" w:hanging="425"/>
+        <w:jc w:val="both"/>
+      </w:pPr>
+      <w:r>
+        <w:rPr>
+          <w:b/>
+        </w:rPr>
+        <w:t>31.</w:t>
+        <w:tab/>
+      </w:r>
+      <w:r>
+        <w:t>Você usa com as crianças algum aplicativo, plataforma ou rede social? Em que aparelho? Como cuida das imagens e dos dados delas?</w:t>
+      </w:r>
+    </w:p>
+    <w:p>
+      <w:pPr>
+        <w:spacing w:after="80"/>
+        <w:ind w:left="425" w:hanging="425"/>
+        <w:jc w:val="both"/>
+      </w:pPr>
+      <w:r>
+        <w:rPr>
+          <w:b/>
+        </w:rPr>
+        <w:t>32.</w:t>
+        <w:tab/>
+      </w:r>
+      <w:r>
+        <w:t>Pensando no acesso, na participação e na proteção das crianças no ambiente digital, o que a escola consegue garantir hoje e o que fica de fora?</w:t>
+      </w:r>
+    </w:p>
+    <w:p>
+      <w:pPr>
+        <w:spacing w:before="240" w:after="120"/>
+      </w:pPr>
+      <w:r>
+        <w:rPr>
+          <w:b/>
+        </w:rPr>
+        <w:t>ENCERRAMENTO</w:t>
+      </w:r>
+    </w:p>
+    <w:p>
+      <w:pPr>
+        <w:spacing w:after="80"/>
+        <w:ind w:left="425" w:hanging="425"/>
+        <w:jc w:val="both"/>
+      </w:pPr>
+      <w:r>
+        <w:rPr>
+          <w:b/>
+        </w:rPr>
+        <w:t>33.</w:t>
+        <w:tab/>
+      </w:r>
+      <w:r>
+        <w:t>Quando a política não faz chegar o equipamento nem a formação, quem, na sua experiência, acaba arcando com essa ausência?</w:t>
+      </w:r>
+    </w:p>
+    <w:p>
+      <w:pPr>
+        <w:spacing w:after="80"/>
+        <w:ind w:left="425" w:hanging="425"/>
+        <w:jc w:val="both"/>
+      </w:pPr>
+      <w:r>
+        <w:rPr>
+          <w:b/>
+        </w:rPr>
+        <w:t>34.</w:t>
+        <w:tab/>
+      </w:r>
+      <w:r>
+        <w:t>Há algo sobre a sua experiência, a escola ou a educação digital que não perguntei e que você gostaria de acrescentar?</w:t>
+      </w:r>
+    </w:p>
+    <w:p>
+      <w:pPr>
+        <w:spacing w:before="240" w:after="120"/>
+      </w:pPr>
+      <w:r>
+        <w:rPr>
+          <w:b/>
+        </w:rPr>
+        <w:t>PARTE 2 – ADAPTAÇÃO PARA COORDENAÇÃO PEDAGÓGICA E DIREÇÃO</w:t>
+      </w:r>
+    </w:p>
+    <w:p>
+      <w:pPr>
+        <w:spacing w:after="80"/>
+        <w:jc w:val="both"/>
+      </w:pPr>
+      <w:r>
+        <w:rPr>
+          <w:sz w:val="22"/>
+        </w:rPr>
+        <w:t>Mantêm-se os seis eixos. As perguntas abaixo substituem ou complementam as da Parte 1, deslocando o foco da regência para a mediação pedagógica, a gestão de recursos escassos e a interlocução com a rede.</w:t>
+      </w:r>
+    </w:p>
+    <w:p>
+      <w:pPr>
+        <w:spacing w:after="80"/>
+        <w:ind w:left="425" w:hanging="425"/>
+        <w:jc w:val="both"/>
+      </w:pPr>
+      <w:r>
+        <w:rPr>
+          <w:b/>
+        </w:rPr>
+        <w:t>1.</w:t>
+        <w:tab/>
+      </w:r>
+      <w:r>
+        <w:t>Conte sua trajetória e como você descreve o papel da coordenação (ou da direção) na organização do trabalho pedagógico desta escola.</w:t>
+      </w:r>
+    </w:p>
+    <w:p>
+      <w:pPr>
+        <w:spacing w:after="80"/>
+        <w:ind w:left="425" w:hanging="425"/>
+        <w:jc w:val="both"/>
+      </w:pPr>
+      <w:r>
+        <w:rPr>
+          <w:b/>
+        </w:rPr>
+        <w:t>2.</w:t>
+        <w:tab/>
+      </w:r>
+      <w:r>
+        <w:t>Como a gestão tomou conhecimento da PNED e de que forma ela foi apresentada à equipe? O que foi destacado e o que ficou de fora?</w:t>
+      </w:r>
+    </w:p>
+    <w:p>
+      <w:pPr>
+        <w:spacing w:after="80"/>
+        <w:ind w:left="425" w:hanging="425"/>
+        <w:jc w:val="both"/>
+      </w:pPr>
+      <w:r>
+        <w:rPr>
+          <w:b/>
+        </w:rPr>
+        <w:t>3.</w:t>
+        <w:tab/>
+      </w:r>
+      <w:r>
+        <w:t>Que orientações, cobranças ou apoios chegam da Secretaria Municipal de Educação em relação à educação digital?</w:t>
+      </w:r>
+    </w:p>
+    <w:p>
+      <w:pPr>
+        <w:spacing w:after="80"/>
+        <w:ind w:left="425" w:hanging="425"/>
+        <w:jc w:val="both"/>
+      </w:pPr>
+      <w:r>
+        <w:rPr>
+          <w:b/>
+        </w:rPr>
+        <w:t>4.</w:t>
+        <w:tab/>
+      </w:r>
+      <w:r>
+        <w:t>Como a escola distribui recursos tecnológicos limitados entre as turmas e entre o pedagógico e o administrativo?</w:t>
+      </w:r>
+    </w:p>
+    <w:p>
+      <w:pPr>
+        <w:spacing w:after="80"/>
+        <w:ind w:left="425" w:hanging="425"/>
+        <w:jc w:val="both"/>
+      </w:pPr>
+      <w:r>
+        <w:rPr>
+          <w:b/>
+        </w:rPr>
+        <w:t>5.</w:t>
+        <w:tab/>
+      </w:r>
+      <w:r>
+        <w:t>Que registros, relatórios ou indicadores sobre educação digital a escola precisa produzir e para quem? Como a equipe é mobilizada para isso?</w:t>
+      </w:r>
+    </w:p>
+    <w:p>
+      <w:pPr>
+        <w:spacing w:after="80"/>
+        <w:ind w:left="425" w:hanging="425"/>
+        <w:jc w:val="both"/>
+      </w:pPr>
+      <w:r>
+        <w:rPr>
+          <w:b/>
+        </w:rPr>
+        <w:t>6.</w:t>
+        <w:tab/>
+      </w:r>
+      <w:r>
+        <w:t>Já houve situações em que foi preciso apresentar à rede um trabalho de educação digital que, na prática, não aconteceu como registrado? Como a gestão lida com essa distância?</w:t>
+      </w:r>
+    </w:p>
+    <w:p>
+      <w:pPr>
+        <w:spacing w:after="80"/>
+        <w:ind w:left="425" w:hanging="425"/>
+        <w:jc w:val="both"/>
+      </w:pPr>
+      <w:r>
+        <w:rPr>
+          <w:b/>
+        </w:rPr>
+        <w:t>7.</w:t>
+        <w:tab/>
+      </w:r>
+      <w:r>
+        <w:t>Quando uma exigência da política não cabe na realidade da escola, como a gestão decide o que fazer, adaptar ou deixar para depois?</w:t>
+      </w:r>
+    </w:p>
+    <w:p>
+      <w:pPr>
+        <w:spacing w:after="80"/>
+        <w:ind w:left="425" w:hanging="425"/>
+        <w:jc w:val="both"/>
+      </w:pPr>
+      <w:r>
+        <w:rPr>
+          <w:b/>
+        </w:rPr>
+        <w:t>8.</w:t>
+        <w:tab/>
+      </w:r>
+      <w:r>
+        <w:t>Como a gestão avalia a presença de plataformas digitais, programas externos ou empresas parceiras na rotina da escola?</w:t>
+      </w:r>
+    </w:p>
+    <w:p>
+      <w:pPr>
+        <w:spacing w:after="80"/>
+        <w:ind w:left="425" w:hanging="425"/>
+        <w:jc w:val="both"/>
+      </w:pPr>
+      <w:r>
+        <w:rPr>
+          <w:b/>
+        </w:rPr>
+        <w:t>9.</w:t>
+        <w:tab/>
+      </w:r>
+      <w:r>
+        <w:t>Quando falta um recurso, o que a coordenação ou a direção costuma fazer? Já recorreu a meios próprios? Havia outra alternativa?</w:t>
+      </w:r>
+    </w:p>
+    <w:p>
+      <w:pPr>
+        <w:spacing w:after="80"/>
+        <w:ind w:left="425" w:hanging="425"/>
+        <w:jc w:val="both"/>
+      </w:pPr>
+      <w:r>
+        <w:rPr>
+          <w:b/>
+        </w:rPr>
+        <w:t>10.</w:t>
+        <w:tab/>
+      </w:r>
+      <w:r>
+        <w:t>O que a escola tem conseguido garantir às crianças em termos de acesso, participação e proteção no ambiente digital, e o que considera fora do seu alcance?</w:t>
+      </w:r>
+    </w:p>
+    <w:p>
+      <w:pPr>
+        <w:spacing w:before="240" w:after="120"/>
+      </w:pPr>
+      <w:r>
+        <w:rPr>
+          <w:b/>
+        </w:rPr>
+        <w:t>PARTE 3 – DIRETRIZES DE APLICAÇÃO</w:t>
+      </w:r>
+    </w:p>
+    <w:p>
+      <w:pPr>
+        <w:spacing w:after="80"/>
+        <w:jc w:val="both"/>
+      </w:pPr>
+      <w:r>
+        <w:rPr>
+          <w:sz w:val="22"/>
+        </w:rPr>
+        <w:t>Flexibilidade: o roteiro é guia, não protocolo fixo; a ordem pode mudar conforme a narrativa do participante, e temas emergentes podem ser aprofundados.</w:t>
+      </w:r>
+    </w:p>
+    <w:p>
+      <w:pPr>
+        <w:spacing w:after="80"/>
+        <w:jc w:val="both"/>
+      </w:pPr>
+      <w:r>
+        <w:rPr>
+          <w:sz w:val="22"/>
+        </w:rPr>
+        <w:t>Experiência vivida: priorizar relatos de situações concretas (“conte uma vez em que…”), evitando respostas abstratas ou normativas.</w:t>
+      </w:r>
+    </w:p>
+    <w:p>
+      <w:pPr>
+        <w:spacing w:after="80"/>
+        <w:jc w:val="both"/>
+      </w:pPr>
+      <w:r>
+        <w:rPr>
+          <w:sz w:val="22"/>
+        </w:rPr>
+        <w:t>Linguagem: as categorias analíticas (performatividade, fabricação, omissão seletiva, tradução subversiva) não serão mencionadas aos participantes. Elas orientam a análise, não a pergunta, para não induzir respostas nem produzir julgamento sobre o trabalho dos profissionais.</w:t>
+      </w:r>
+    </w:p>
+    <w:p>
+      <w:pPr>
+        <w:spacing w:after="80"/>
+        <w:jc w:val="both"/>
+      </w:pPr>
+      <w:r>
+        <w:rPr>
+          <w:sz w:val="22"/>
+        </w:rPr>
+        <w:t>Ordem dos eixos: as perguntas sobre funcionamento e cotidiano (Eixo 3) antecedem as perguntas sobre registros e cobranças (Eixo 4) e sobre decisões de não fazer ou de transformar orientações (Eixo 5). A entrevistadora registrará se o relato surgiu espontaneamente ou depois de pergunta direta.</w:t>
+      </w:r>
+    </w:p>
+    <w:p>
+      <w:pPr>
+        <w:spacing w:after="80"/>
+        <w:jc w:val="both"/>
+      </w:pPr>
+      <w:r>
+        <w:rPr>
+          <w:sz w:val="22"/>
+        </w:rPr>
+        <w:t>Cuidado ético adicional: relatos sobre registros que não correspondem à prática serão tratados como expressão das condições de trabalho, e não como falta individual; nenhum trecho permitirá identificar o participante.</w:t>
+      </w:r>
+    </w:p>
+    <w:p>
+      <w:pPr>
+        <w:spacing w:after="80"/>
+        <w:jc w:val="both"/>
+      </w:pPr>
+      <w:r>
+        <w:rPr>
+          <w:sz w:val="22"/>
+        </w:rPr>
+        <w:t>Diário de campo: registrar expressões, hesitações, ênfases e silêncios, que subsidiarão a análise e a reflexividade da pesquisadora.</w:t>
       </w:r>
     </w:p>
     <w:sectPr>

</xml_diff>

<commit_message>
Capítulos alinhados ao novo projeto (encenação da PNED, teoria da atuação, sem Lipsky) e projeto ajustado
Co-Authored-By: Claude Opus 5.5 <noreply@anthropic.com>
Claude-Session: https://claude.ai/code/session_01HxStpW4pQoDfJdTDYr6zEC
</commit_message>
<xml_diff>
--- a/projeto_reformulado/PROJETO_TESE_ENCENACAO_PNED.docx
+++ b/projeto_reformulado/PROJETO_TESE_ENCENACAO_PNED.docx
@@ -395,7 +395,7 @@
         <w:jc w:val="both"/>
       </w:pPr>
       <w:r>
-        <w:t>A teoria da atuação toma a escola como arena de encenação, interpretação e tradução das políticas, e os profissionais da educação como produtores de política no plano local (BALL; MAGUIRE; BRAUN, 2016). Os autores mostram que a política e o contexto se constituem mutuamente: “A política cria o contexto, mas o contexto também precede a política” (BALL; MAGUIRE; BRAUN, 2016, p. 36). Por isso, propõem examinar a atuação em relação a quatro dimensões do contexto: a situacional, que diz respeito à história, à localização e à composição da escola; a das culturas profissionais; a material, relativa a edifícios, orçamentos, equipamentos e infraestrutura; e a externa, que envolve pressões, apoios e expectativas vindos de fora da escola (BRAUN; MAGUIRE; BALL, 2010). Essas dimensões orientam tanto a leitura do território quanto a análise das narrativas.</w:t>
+        <w:t>A teoria da atuação toma a escola como arena de encenação, interpretação e tradução das políticas, e os profissionais da educação como produtores de política no plano local (BALL; MAGUIRE; BRAUN, 2016). Os autores mostram que a política e o contexto se constituem mutuamente: “A política cria o contexto, mas o contexto também precede a política” (BALL; MAGUIRE; BRAUN, 2016, p. 36). Por isso, propõem examinar a atuação em relação a quatro dimensões do contexto: a situacional, que diz respeito à história, à localização e à composição da escola; a das culturas profissionais; a material, relativa a edifícios, orçamentos, equipamentos e infraestrutura; e a externa, que envolve pressões, apoios e expectativas vindos de fora da escola (BALL; MAGUIRE; BRAUN, 2016). Essas dimensões orientam tanto a leitura do território quanto a análise das narrativas.</w:t>
       </w:r>
     </w:p>
     <w:p>
@@ -464,7 +464,7 @@
         <w:jc w:val="both"/>
       </w:pPr>
       <w:r>
-        <w:t>Compreendemos a resistência para além da recusa oficial. Ela pode assumir a forma de práticas táticas construídas no encontro diário entre a norma e a realidade da escola: a omissão seletiva do que é inexequível, a tradução da norma para finalidades locais e a fabricação de registros que atendam às exigências formais enquanto protegem a prática possível. Esses movimentos serão lidos com cautela, sem romantizar o improviso e sem tratá-lo como falha individual, pois expressam as condições em que o trabalho se realiza.</w:t>
+        <w:t>Compreendemos a resistência para além da recusa oficial. Ela pode assumir a forma de práticas táticas construídas no encontro diário entre a norma e a realidade da escola: a omissão seletiva do que é inexequível, a tradução da norma para finalidades locais e a fabricação de registros que atendam às exigências formais enquanto protegem a prática possível, no sentido das fabricações descritas por Ball (2002). Esses movimentos serão lidos com cautela, sem romantizar o improviso e sem tratá-lo como falha individual, pois expressam as condições em que o trabalho se realiza.</w:t>
       </w:r>
     </w:p>
     <w:p>
@@ -569,7 +569,7 @@
         <w:jc w:val="both"/>
       </w:pPr>
       <w:r>
-        <w:t>O lócus, entendido como contexto da prática, é a Escola Municipal Domitila Castelo, no distrito de Pipa, em Tibau do Sul (RN). Os sujeitos são profissionais da educação que atuam na instituição, abrangendo a direção, a coordenação pedagógica e as professoras dos anos iniciais, a fim de captar a multiplicidade de interpretações e de posições na organização escolar.</w:t>
+        <w:t>O lócus, entendido como contexto da prática, é a Escola Municipal Domitila Castelo, no distrito de Pipa, em Tibau do Sul (RN). Os sujeitos são profissionais da educação que atuam na instituição, abrangendo a direção, a coordenação pedagógica e as professoras das turmas de 1º e 2º anos do Ensino Fundamental, num total de onze participantes, a fim de captar a multiplicidade de interpretações e de posições na organização escolar.</w:t>
       </w:r>
     </w:p>
     <w:p>
@@ -592,7 +592,7 @@
         <w:jc w:val="both"/>
       </w:pPr>
       <w:r>
-        <w:t>A produção de dados se apoia na triangulação de três instrumentos. A análise documental examina a Lei nº 14.533/2023 em contraste com os documentos institucionais da escola, como o Projeto Político-Pedagógico e os planejamentos, observando como a linguagem oficial é absorvida ou tensionada no papel. O questionário de perfil e percepções (Apêndice A) delineia o perfil socioeconômico e profissional da equipe, as condições materiais de trabalho e as formas preliminares pelas quais esses sujeitos habitam o digital. As entrevistas semiestruturadas em profundidade (Apêndice B), instrumento central, serão conduzidas como narrativas, para escutar como os profissionais decodificam os textos da política (interpretação), que táticas utilizam no cotidiano (tradução) e como respondem às cobranças (performatividade e resistências). O registro iconográfico e o acervo do Museu Digital de Pipa, já reunidos, sustentam a caracterização do território e das condições materiais da escola.</w:t>
+        <w:t>A produção de dados se apoia na triangulação de três instrumentos. A análise documental examina a Lei nº 14.533/2023 em contraste com os documentos institucionais da escola, como o Projeto Político-Pedagógico e os planejamentos, observando como a linguagem oficial é absorvida ou tensionada no papel. O questionário de perfil e percepções (Apêndice A), aplicado presencialmente em formulário digital, delineia o perfil socioeconômico e profissional da equipe, as condições materiais de trabalho e as formas preliminares pelas quais esses sujeitos habitam o digital. As entrevistas semiestruturadas em profundidade (Apêndice B), instrumento central, serão conduzidas como narrativas, para escutar como os profissionais decodificam os textos da política (interpretação), que táticas utilizam no cotidiano (tradução) e como respondem às cobranças (performatividade e resistências). O registro iconográfico e o acervo do Museu Digital de Pipa, já reunidos, sustentam a caracterização do território e das condições materiais da escola.</w:t>
       </w:r>
     </w:p>
     <w:p>
@@ -725,6 +725,14 @@
         <w:spacing w:line="240" w:lineRule="auto" w:after="240"/>
       </w:pPr>
       <w:r>
+        <w:t>BALL, Stephen J. Reformar escolas/reformar professores e os terrores da performatividade. Revista Portuguesa de Educação, Braga, v. 15, n. 2, p. 3-23, 2002.</w:t>
+      </w:r>
+    </w:p>
+    <w:p>
+      <w:pPr>
+        <w:spacing w:line="240" w:lineRule="auto" w:after="240"/>
+      </w:pPr>
+      <w:r>
         <w:t>BALL, Stephen J. Performatividade, privatização e o pós-Estado do bem-estar. Educação &amp; Sociedade, Campinas, v. 25, n. 89, p. 1105-1126, set./dez. 2004.</w:t>
       </w:r>
     </w:p>
@@ -774,14 +782,6 @@
       </w:pPr>
       <w:r>
         <w:t>BRASIL. Lei nº 15.211, de 17 de setembro de 2025. Dispõe sobre a proteção de crianças e adolescentes em ambientes digitais (Estatuto Digital da Criança e do Adolescente). Brasília, DF: Diário Oficial da União, 2025.</w:t>
-      </w:r>
-    </w:p>
-    <w:p>
-      <w:pPr>
-        <w:spacing w:line="240" w:lineRule="auto" w:after="240"/>
-      </w:pPr>
-      <w:r>
-        <w:t>BRAUN, Annette; MAGUIRE, Meg; BALL, Stephen J. Policy enactments in the UK secondary school: examining policy, practice and school positioning. Journal of Education Policy, v. 25, n. 4, p. 547-560, 2010.</w:t>
       </w:r>
     </w:p>
     <w:p>
@@ -924,7 +924,7 @@
         <w:t xml:space="preserve">Público: </w:t>
       </w:r>
       <w:r>
-        <w:t>Profissionais da educação da Escola Municipal Domitila Castelo, em Pipa, Tibau do Sul (RN), que atuam na direção, na coordenação pedagógica e na docência dos anos iniciais do Ensino Fundamental.</w:t>
+        <w:t>Onze profissionais da educação da Escola Municipal Domitila Castelo, em Pipa, Tibau do Sul (RN): seis que atuam nas turmas de 1º e 2º anos do Ensino Fundamental, quatro da coordenação pedagógica e um da direção escolar.</w:t>
       </w:r>
     </w:p>
     <w:p>
@@ -954,7 +954,7 @@
         <w:t xml:space="preserve">Forma de aplicação: </w:t>
       </w:r>
       <w:r>
-        <w:t>individual, antes das entrevistas, em formulário impresso ou digital, conforme a preferência do participante.</w:t>
+        <w:t>individual e presencial, em formulário digital, antes das entrevistas. A pesquisadora pode esclarecer dúvidas sobre os enunciados, e o preenchimento fica a cargo de cada participante.</w:t>
       </w:r>
     </w:p>
     <w:p>
@@ -1003,7 +1003,7 @@
         <w:ind w:left="425"/>
       </w:pPr>
       <w:r>
-        <w:t>( ) Docência nos anos iniciais do Ensino Fundamental</w:t>
+        <w:t>( ) Docência no 1º ou no 2º ano do Ensino Fundamental</w:t>
       </w:r>
     </w:p>
     <w:p>
@@ -1053,7 +1053,7 @@
         <w:ind w:left="425"/>
       </w:pPr>
       <w:r>
-        <w:t>[ ] 1º ano</w:t>
+        <w:t>( ) 1º ano</w:t>
       </w:r>
     </w:p>
     <w:p>
@@ -1062,7 +1062,7 @@
         <w:ind w:left="425"/>
       </w:pPr>
       <w:r>
-        <w:t>[ ] 2º ano</w:t>
+        <w:t>( ) 2º ano</w:t>
       </w:r>
     </w:p>
     <w:p>
@@ -1071,34 +1071,7 @@
         <w:ind w:left="425"/>
       </w:pPr>
       <w:r>
-        <w:t>[ ] 3º ano</w:t>
-      </w:r>
-    </w:p>
-    <w:p>
-      <w:pPr>
-        <w:spacing w:after="0"/>
-        <w:ind w:left="425"/>
-      </w:pPr>
-      <w:r>
-        <w:t>[ ] 4º ano</w:t>
-      </w:r>
-    </w:p>
-    <w:p>
-      <w:pPr>
-        <w:spacing w:after="0"/>
-        <w:ind w:left="425"/>
-      </w:pPr>
-      <w:r>
-        <w:t>[ ] 5º ano</w:t>
-      </w:r>
-    </w:p>
-    <w:p>
-      <w:pPr>
-        <w:spacing w:after="0"/>
-        <w:ind w:left="425"/>
-      </w:pPr>
-      <w:r>
-        <w:t>[ ] Não se aplica</w:t>
+        <w:t>( ) Não se aplica</w:t>
       </w:r>
     </w:p>
     <w:p>
@@ -2288,7 +2261,7 @@
         <w:t xml:space="preserve">25. </w:t>
       </w:r>
       <w:r>
-        <w:t>Você já usou recursos próprios (celular, pacote de dados, impressão, material comprado) para realizar atividades da escola?</w:t>
+        <w:t>Na sua percepção, as características de Pipa (turismo, desigualdades entre áreas do distrito, oscilação de sinal, rotina das famílias) influenciam o acesso das crianças ao digital?</w:t>
       </w:r>
     </w:p>
     <w:p>
@@ -2297,7 +2270,7 @@
         <w:ind w:left="425"/>
       </w:pPr>
       <w:r>
-        <w:t>( ) Frequentemente</w:t>
+        <w:t>( ) Sim</w:t>
       </w:r>
     </w:p>
     <w:p>
@@ -2306,7 +2279,7 @@
         <w:ind w:left="425"/>
       </w:pPr>
       <w:r>
-        <w:t>( ) Às vezes</w:t>
+        <w:t>( ) Parcialmente</w:t>
       </w:r>
     </w:p>
     <w:p>
@@ -2315,16 +2288,7 @@
         <w:ind w:left="425"/>
       </w:pPr>
       <w:r>
-        <w:t>( ) Raramente</w:t>
-      </w:r>
-    </w:p>
-    <w:p>
-      <w:pPr>
-        <w:spacing w:after="0"/>
-        <w:ind w:left="425"/>
-      </w:pPr>
-      <w:r>
-        <w:t>( ) Nunca</w:t>
+        <w:t>( ) Não</w:t>
       </w:r>
     </w:p>
     <w:p>
@@ -2338,34 +2302,34 @@
         <w:t xml:space="preserve">26. </w:t>
       </w:r>
       <w:r>
-        <w:t>Na sua percepção, as características de Pipa (turismo, desigualdades entre áreas do distrito, oscilação de sinal, rotina das famílias) influenciam o acesso das crianças ao digital?</w:t>
+        <w:t>Se respondeu sim ou parcialmente, de que modo essa influência aparece no cotidiano da escola?</w:t>
       </w:r>
     </w:p>
     <w:p>
       <w:pPr>
         <w:spacing w:after="0"/>
-        <w:ind w:left="425"/>
-      </w:pPr>
-      <w:r>
-        <w:t>( ) Sim</w:t>
+      </w:pPr>
+      <w:r>
+        <w:t>______________________________________________________________________________</w:t>
       </w:r>
     </w:p>
     <w:p>
       <w:pPr>
         <w:spacing w:after="0"/>
-        <w:ind w:left="425"/>
-      </w:pPr>
-      <w:r>
-        <w:t>( ) Parcialmente</w:t>
-      </w:r>
-    </w:p>
-    <w:p>
-      <w:pPr>
-        <w:spacing w:after="0"/>
-        <w:ind w:left="425"/>
-      </w:pPr>
-      <w:r>
-        <w:t>( ) Não</w:t>
+      </w:pPr>
+      <w:r>
+        <w:t>______________________________________________________________________________</w:t>
+      </w:r>
+    </w:p>
+    <w:p>
+      <w:pPr>
+        <w:spacing w:before="240" w:after="120"/>
+      </w:pPr>
+      <w:r>
+        <w:rPr>
+          <w:b/>
+        </w:rPr>
+        <w:t>BLOCO 4 – A PNED NA ESCOLA E AS EXIGÊNCIAS DE REGISTRO E RESULTADO</w:t>
       </w:r>
     </w:p>
     <w:p>
@@ -2379,42 +2343,34 @@
         <w:t xml:space="preserve">27. </w:t>
       </w:r>
       <w:r>
-        <w:t>Se respondeu sim ou parcialmente, de que modo essa influência aparece no cotidiano da escola?</w:t>
+        <w:t>Você conhece a Política Nacional de Educação Digital (Lei nº 14.533/2023)?</w:t>
       </w:r>
     </w:p>
     <w:p>
       <w:pPr>
         <w:spacing w:after="0"/>
-      </w:pPr>
-      <w:r>
-        <w:t>______________________________________________________________________________</w:t>
+        <w:ind w:left="425"/>
+      </w:pPr>
+      <w:r>
+        <w:t>( ) Conheço o texto ou seus eixos</w:t>
       </w:r>
     </w:p>
     <w:p>
       <w:pPr>
         <w:spacing w:after="0"/>
-      </w:pPr>
-      <w:r>
-        <w:t>______________________________________________________________________________</w:t>
+        <w:ind w:left="425"/>
+      </w:pPr>
+      <w:r>
+        <w:t>( ) Já ouvi falar, mas não conheço o conteúdo</w:t>
       </w:r>
     </w:p>
     <w:p>
       <w:pPr>
         <w:spacing w:after="0"/>
-      </w:pPr>
-      <w:r>
-        <w:t>______________________________________________________________________________</w:t>
-      </w:r>
-    </w:p>
-    <w:p>
-      <w:pPr>
-        <w:spacing w:before="240" w:after="120"/>
-      </w:pPr>
-      <w:r>
-        <w:rPr>
-          <w:b/>
-        </w:rPr>
-        <w:t>BLOCO 4 – A PNED NA ESCOLA E AS EXIGÊNCIAS DE REGISTRO E RESULTADO</w:t>
+        <w:ind w:left="425"/>
+      </w:pPr>
+      <w:r>
+        <w:t>( ) Não conheço</w:t>
       </w:r>
     </w:p>
     <w:p>
@@ -2428,7 +2384,7 @@
         <w:t xml:space="preserve">28. </w:t>
       </w:r>
       <w:r>
-        <w:t>Você conhece a Política Nacional de Educação Digital (Lei nº 14.533/2023)?</w:t>
+        <w:t>Por qual meio a PNED chegou até você? (Pode assinalar mais de uma)</w:t>
       </w:r>
     </w:p>
     <w:p>
@@ -2437,7 +2393,7 @@
         <w:ind w:left="425"/>
       </w:pPr>
       <w:r>
-        <w:t>( ) Conheço o texto ou seus eixos</w:t>
+        <w:t>[ ] Orientações ou documentos da escola</w:t>
       </w:r>
     </w:p>
     <w:p>
@@ -2446,7 +2402,7 @@
         <w:ind w:left="425"/>
       </w:pPr>
       <w:r>
-        <w:t>( ) Já ouvi falar, mas não conheço o conteúdo</w:t>
+        <w:t>[ ] Reuniões ou formações da Secretaria Municipal de Educação</w:t>
       </w:r>
     </w:p>
     <w:p>
@@ -2455,7 +2411,43 @@
         <w:ind w:left="425"/>
       </w:pPr>
       <w:r>
-        <w:t>( ) Não conheço</w:t>
+        <w:t>[ ] Cursos de formação continuada</w:t>
+      </w:r>
+    </w:p>
+    <w:p>
+      <w:pPr>
+        <w:spacing w:after="0"/>
+        <w:ind w:left="425"/>
+      </w:pPr>
+      <w:r>
+        <w:t>[ ] BNCC ou documentos curriculares</w:t>
+      </w:r>
+    </w:p>
+    <w:p>
+      <w:pPr>
+        <w:spacing w:after="0"/>
+        <w:ind w:left="425"/>
+      </w:pPr>
+      <w:r>
+        <w:t>[ ] Imprensa, redes sociais ou internet</w:t>
+      </w:r>
+    </w:p>
+    <w:p>
+      <w:pPr>
+        <w:spacing w:after="0"/>
+        <w:ind w:left="425"/>
+      </w:pPr>
+      <w:r>
+        <w:t>[ ] Outro: ______________</w:t>
+      </w:r>
+    </w:p>
+    <w:p>
+      <w:pPr>
+        <w:spacing w:after="0"/>
+        <w:ind w:left="425"/>
+      </w:pPr>
+      <w:r>
+        <w:t>[ ] Não conheço a política</w:t>
       </w:r>
     </w:p>
     <w:p>
@@ -2469,7 +2461,7 @@
         <w:t xml:space="preserve">29. </w:t>
       </w:r>
       <w:r>
-        <w:t>Por qual meio a PNED chegou até você? (Pode assinalar mais de uma)</w:t>
+        <w:t>A escola ou a rede ofereceu orientações sobre a PNED?</w:t>
       </w:r>
     </w:p>
     <w:p>
@@ -2478,7 +2470,7 @@
         <w:ind w:left="425"/>
       </w:pPr>
       <w:r>
-        <w:t>[ ] Orientações ou documentos da escola</w:t>
+        <w:t>( ) Sim, com debate e orientações pedagógicas</w:t>
       </w:r>
     </w:p>
     <w:p>
@@ -2487,7 +2479,7 @@
         <w:ind w:left="425"/>
       </w:pPr>
       <w:r>
-        <w:t>[ ] Reuniões ou formações da Secretaria Municipal de Educação</w:t>
+        <w:t>( ) Sim, mas de forma superficial</w:t>
       </w:r>
     </w:p>
     <w:p>
@@ -2496,43 +2488,7 @@
         <w:ind w:left="425"/>
       </w:pPr>
       <w:r>
-        <w:t>[ ] Cursos de formação continuada</w:t>
-      </w:r>
-    </w:p>
-    <w:p>
-      <w:pPr>
-        <w:spacing w:after="0"/>
-        <w:ind w:left="425"/>
-      </w:pPr>
-      <w:r>
-        <w:t>[ ] BNCC ou documentos curriculares</w:t>
-      </w:r>
-    </w:p>
-    <w:p>
-      <w:pPr>
-        <w:spacing w:after="0"/>
-        <w:ind w:left="425"/>
-      </w:pPr>
-      <w:r>
-        <w:t>[ ] Imprensa, redes sociais ou internet</w:t>
-      </w:r>
-    </w:p>
-    <w:p>
-      <w:pPr>
-        <w:spacing w:after="0"/>
-        <w:ind w:left="425"/>
-      </w:pPr>
-      <w:r>
-        <w:t>[ ] Outro: ______________</w:t>
-      </w:r>
-    </w:p>
-    <w:p>
-      <w:pPr>
-        <w:spacing w:after="0"/>
-        <w:ind w:left="425"/>
-      </w:pPr>
-      <w:r>
-        <w:t>[ ] Não conheço a política</w:t>
+        <w:t>( ) Não houve orientação</w:t>
       </w:r>
     </w:p>
     <w:p>
@@ -2546,7 +2502,7 @@
         <w:t xml:space="preserve">30. </w:t>
       </w:r>
       <w:r>
-        <w:t>A escola ou a rede ofereceu orientações sobre a PNED?</w:t>
+        <w:t>O trabalho com educação digital na escola costuma gerar algum tipo de registro, relatório, planilha, evidência fotográfica ou lançamento em sistema?</w:t>
       </w:r>
     </w:p>
     <w:p>
@@ -2555,7 +2511,7 @@
         <w:ind w:left="425"/>
       </w:pPr>
       <w:r>
-        <w:t>( ) Sim, com debate e orientações pedagógicas</w:t>
+        <w:t>( ) Sim, com frequência</w:t>
       </w:r>
     </w:p>
     <w:p>
@@ -2564,7 +2520,7 @@
         <w:ind w:left="425"/>
       </w:pPr>
       <w:r>
-        <w:t>( ) Sim, mas de forma superficial</w:t>
+        <w:t>( ) Às vezes</w:t>
       </w:r>
     </w:p>
     <w:p>
@@ -2573,7 +2529,7 @@
         <w:ind w:left="425"/>
       </w:pPr>
       <w:r>
-        <w:t>( ) Não houve orientação</w:t>
+        <w:t>( ) Não</w:t>
       </w:r>
     </w:p>
     <w:p>
@@ -2587,7 +2543,7 @@
         <w:t xml:space="preserve">31. </w:t>
       </w:r>
       <w:r>
-        <w:t>O trabalho com educação digital na escola costuma gerar algum tipo de registro, relatório, planilha, evidência fotográfica ou lançamento em sistema?</w:t>
+        <w:t>Se sim, para quem esses registros são encaminhados? (Pode assinalar mais de uma)</w:t>
       </w:r>
     </w:p>
     <w:p>
@@ -2596,7 +2552,7 @@
         <w:ind w:left="425"/>
       </w:pPr>
       <w:r>
-        <w:t>( ) Sim, com frequência</w:t>
+        <w:t>[ ] Coordenação ou direção da escola</w:t>
       </w:r>
     </w:p>
     <w:p>
@@ -2605,7 +2561,7 @@
         <w:ind w:left="425"/>
       </w:pPr>
       <w:r>
-        <w:t>( ) Às vezes</w:t>
+        <w:t>[ ] Secretaria Municipal de Educação</w:t>
       </w:r>
     </w:p>
     <w:p>
@@ -2614,7 +2570,34 @@
         <w:ind w:left="425"/>
       </w:pPr>
       <w:r>
-        <w:t>( ) Não</w:t>
+        <w:t>[ ] Plataformas ou programas federais</w:t>
+      </w:r>
+    </w:p>
+    <w:p>
+      <w:pPr>
+        <w:spacing w:after="0"/>
+        <w:ind w:left="425"/>
+      </w:pPr>
+      <w:r>
+        <w:t>[ ] Programas ou empresas parceiras</w:t>
+      </w:r>
+    </w:p>
+    <w:p>
+      <w:pPr>
+        <w:spacing w:after="0"/>
+        <w:ind w:left="425"/>
+      </w:pPr>
+      <w:r>
+        <w:t>[ ] Outro: ______________</w:t>
+      </w:r>
+    </w:p>
+    <w:p>
+      <w:pPr>
+        <w:spacing w:after="0"/>
+        <w:ind w:left="425"/>
+      </w:pPr>
+      <w:r>
+        <w:t>[ ] Não se aplica</w:t>
       </w:r>
     </w:p>
     <w:p>
@@ -2628,7 +2611,7 @@
         <w:t xml:space="preserve">32. </w:t>
       </w:r>
       <w:r>
-        <w:t>Se sim, para quem esses registros são encaminhados? (Pode assinalar mais de uma)</w:t>
+        <w:t>Na sua percepção, o que é registrado sobre educação digital corresponde ao que de fato acontece com as crianças?</w:t>
       </w:r>
     </w:p>
     <w:p>
@@ -2637,7 +2620,7 @@
         <w:ind w:left="425"/>
       </w:pPr>
       <w:r>
-        <w:t>[ ] Coordenação ou direção da escola</w:t>
+        <w:t>( ) Corresponde plenamente</w:t>
       </w:r>
     </w:p>
     <w:p>
@@ -2646,7 +2629,7 @@
         <w:ind w:left="425"/>
       </w:pPr>
       <w:r>
-        <w:t>[ ] Secretaria Municipal de Educação</w:t>
+        <w:t>( ) Corresponde em parte</w:t>
       </w:r>
     </w:p>
     <w:p>
@@ -2655,7 +2638,7 @@
         <w:ind w:left="425"/>
       </w:pPr>
       <w:r>
-        <w:t>[ ] Plataformas ou programas federais</w:t>
+        <w:t>( ) Corresponde pouco</w:t>
       </w:r>
     </w:p>
     <w:p>
@@ -2664,25 +2647,7 @@
         <w:ind w:left="425"/>
       </w:pPr>
       <w:r>
-        <w:t>[ ] Programas ou empresas parceiras</w:t>
-      </w:r>
-    </w:p>
-    <w:p>
-      <w:pPr>
-        <w:spacing w:after="0"/>
-        <w:ind w:left="425"/>
-      </w:pPr>
-      <w:r>
-        <w:t>[ ] Outro: ______________</w:t>
-      </w:r>
-    </w:p>
-    <w:p>
-      <w:pPr>
-        <w:spacing w:after="0"/>
-        <w:ind w:left="425"/>
-      </w:pPr>
-      <w:r>
-        <w:t>[ ] Não se aplica</w:t>
+        <w:t>( ) Não sei avaliar</w:t>
       </w:r>
     </w:p>
     <w:p>
@@ -2696,7 +2661,7 @@
         <w:t xml:space="preserve">33. </w:t>
       </w:r>
       <w:r>
-        <w:t>Na sua percepção, o que é registrado sobre educação digital corresponde ao que de fato acontece com as crianças?</w:t>
+        <w:t>O texto da PNED considera as condições materiais das escolas municipais?</w:t>
       </w:r>
     </w:p>
     <w:p>
@@ -2705,7 +2670,7 @@
         <w:ind w:left="425"/>
       </w:pPr>
       <w:r>
-        <w:t>( ) Corresponde plenamente</w:t>
+        <w:t>( ) Considera plenamente</w:t>
       </w:r>
     </w:p>
     <w:p>
@@ -2714,7 +2679,7 @@
         <w:ind w:left="425"/>
       </w:pPr>
       <w:r>
-        <w:t>( ) Corresponde em parte</w:t>
+        <w:t>( ) Considera em parte, com exigências distantes da escola</w:t>
       </w:r>
     </w:p>
     <w:p>
@@ -2723,7 +2688,7 @@
         <w:ind w:left="425"/>
       </w:pPr>
       <w:r>
-        <w:t>( ) Corresponde pouco</w:t>
+        <w:t>( ) Não considera</w:t>
       </w:r>
     </w:p>
     <w:p>
@@ -2732,7 +2697,18 @@
         <w:ind w:left="425"/>
       </w:pPr>
       <w:r>
-        <w:t>( ) Não sei avaliar</w:t>
+        <w:t>( ) Não sei opinar</w:t>
+      </w:r>
+    </w:p>
+    <w:p>
+      <w:pPr>
+        <w:spacing w:before="240" w:after="120"/>
+      </w:pPr>
+      <w:r>
+        <w:rPr>
+          <w:b/>
+        </w:rPr>
+        <w:t>BLOCO 5 – CONCEPÇÕES DE EDUCAÇÃO DIGITAL E DIREITOS DA CRIANÇA</w:t>
       </w:r>
     </w:p>
     <w:p>
@@ -2746,7 +2722,7 @@
         <w:t xml:space="preserve">34. </w:t>
       </w:r>
       <w:r>
-        <w:t>O texto da PNED considera as condições materiais das escolas municipais?</w:t>
+        <w:t>Quando você pensa em “educação digital” nos anos iniciais, o que vem primeiro? (Assinale até duas)</w:t>
       </w:r>
     </w:p>
     <w:p>
@@ -2755,7 +2731,7 @@
         <w:ind w:left="425"/>
       </w:pPr>
       <w:r>
-        <w:t>( ) Considera plenamente</w:t>
+        <w:t>[ ] Usar equipamentos e aplicativos nas aulas</w:t>
       </w:r>
     </w:p>
     <w:p>
@@ -2764,7 +2740,7 @@
         <w:ind w:left="425"/>
       </w:pPr>
       <w:r>
-        <w:t>( ) Considera em parte, com exigências distantes da escola</w:t>
+        <w:t>[ ] Ensinar como a internet e os dispositivos funcionam</w:t>
       </w:r>
     </w:p>
     <w:p>
@@ -2773,7 +2749,7 @@
         <w:ind w:left="425"/>
       </w:pPr>
       <w:r>
-        <w:t>( ) Não considera</w:t>
+        <w:t>[ ] Desenvolver leitura crítica do que as crianças veem nas telas</w:t>
       </w:r>
     </w:p>
     <w:p>
@@ -2782,18 +2758,25 @@
         <w:ind w:left="425"/>
       </w:pPr>
       <w:r>
-        <w:t>( ) Não sei opinar</w:t>
-      </w:r>
-    </w:p>
-    <w:p>
-      <w:pPr>
-        <w:spacing w:before="240" w:after="120"/>
-      </w:pPr>
-      <w:r>
-        <w:rPr>
-          <w:b/>
-        </w:rPr>
-        <w:t>BLOCO 5 – CONCEPÇÕES DE EDUCAÇÃO DIGITAL E DIREITOS DA CRIANÇA</w:t>
+        <w:t>[ ] Proteger as crianças de riscos, publicidade e exposição de dados</w:t>
+      </w:r>
+    </w:p>
+    <w:p>
+      <w:pPr>
+        <w:spacing w:after="0"/>
+        <w:ind w:left="425"/>
+      </w:pPr>
+      <w:r>
+        <w:t>[ ] Garantir que todas as crianças tenham acesso</w:t>
+      </w:r>
+    </w:p>
+    <w:p>
+      <w:pPr>
+        <w:spacing w:after="0"/>
+        <w:ind w:left="425"/>
+      </w:pPr>
+      <w:r>
+        <w:t>[ ] Permitir que as crianças produzam e se expressem com o digital</w:t>
       </w:r>
     </w:p>
     <w:p>
@@ -2807,7 +2790,7 @@
         <w:t xml:space="preserve">35. </w:t>
       </w:r>
       <w:r>
-        <w:t>Quando você pensa em “educação digital” nos anos iniciais, o que vem primeiro? (Assinale até duas)</w:t>
+        <w:t>As crianças chegam à escola com experiências desiguais com celulares, computadores e internet?</w:t>
       </w:r>
     </w:p>
     <w:p>
@@ -2816,7 +2799,7 @@
         <w:ind w:left="425"/>
       </w:pPr>
       <w:r>
-        <w:t>[ ] Usar equipamentos e aplicativos nas aulas</w:t>
+        <w:t>( ) Sim, com contrastes profundos</w:t>
       </w:r>
     </w:p>
     <w:p>
@@ -2825,7 +2808,7 @@
         <w:ind w:left="425"/>
       </w:pPr>
       <w:r>
-        <w:t>[ ] Ensinar como a internet e os dispositivos funcionam</w:t>
+        <w:t>( ) Sim, mas sem grande efeito na rotina</w:t>
       </w:r>
     </w:p>
     <w:p>
@@ -2834,7 +2817,7 @@
         <w:ind w:left="425"/>
       </w:pPr>
       <w:r>
-        <w:t>[ ] Desenvolver leitura crítica do que as crianças veem nas telas</w:t>
+        <w:t>( ) Não</w:t>
       </w:r>
     </w:p>
     <w:p>
@@ -2843,25 +2826,7 @@
         <w:ind w:left="425"/>
       </w:pPr>
       <w:r>
-        <w:t>[ ] Proteger as crianças de riscos, publicidade e exposição de dados</w:t>
-      </w:r>
-    </w:p>
-    <w:p>
-      <w:pPr>
-        <w:spacing w:after="0"/>
-        <w:ind w:left="425"/>
-      </w:pPr>
-      <w:r>
-        <w:t>[ ] Garantir que todas as crianças tenham acesso</w:t>
-      </w:r>
-    </w:p>
-    <w:p>
-      <w:pPr>
-        <w:spacing w:after="0"/>
-        <w:ind w:left="425"/>
-      </w:pPr>
-      <w:r>
-        <w:t>[ ] Permitir que as crianças produzam e se expressem com o digital</w:t>
+        <w:t>( ) Não sei informar</w:t>
       </w:r>
     </w:p>
     <w:p>
@@ -2875,7 +2840,7 @@
         <w:t xml:space="preserve">36. </w:t>
       </w:r>
       <w:r>
-        <w:t>As crianças chegam à escola com experiências desiguais com celulares, computadores e internet?</w:t>
+        <w:t>Na sua escola, qual destes direitos das crianças no ambiente digital parece mais distante de ser garantido?</w:t>
       </w:r>
     </w:p>
     <w:p>
@@ -2884,7 +2849,7 @@
         <w:ind w:left="425"/>
       </w:pPr>
       <w:r>
-        <w:t>( ) Sim, com contrastes profundos</w:t>
+        <w:t>( ) Acesso a equipamentos e conexão de qualidade (provisão)</w:t>
       </w:r>
     </w:p>
     <w:p>
@@ -2893,7 +2858,7 @@
         <w:ind w:left="425"/>
       </w:pPr>
       <w:r>
-        <w:t>( ) Sim, mas sem grande efeito na rotina</w:t>
+        <w:t>( ) Aprender a usar o digital com autonomia e senso crítico (participação)</w:t>
       </w:r>
     </w:p>
     <w:p>
@@ -2902,7 +2867,7 @@
         <w:ind w:left="425"/>
       </w:pPr>
       <w:r>
-        <w:t>( ) Não</w:t>
+        <w:t>( ) Proteção da privacidade, da imagem e dos dados (proteção)</w:t>
       </w:r>
     </w:p>
     <w:p>
@@ -2911,7 +2876,7 @@
         <w:ind w:left="425"/>
       </w:pPr>
       <w:r>
-        <w:t>( ) Não sei informar</w:t>
+        <w:t>( ) Não sei avaliar</w:t>
       </w:r>
     </w:p>
     <w:p>
@@ -2925,7 +2890,7 @@
         <w:t xml:space="preserve">37. </w:t>
       </w:r>
       <w:r>
-        <w:t>Na sua escola, qual destes direitos das crianças no ambiente digital parece mais distante de ser garantido?</w:t>
+        <w:t>Quais são os principais desafios para a educação digital na sua escola? (Assinale até três)</w:t>
       </w:r>
     </w:p>
     <w:p>
@@ -2934,7 +2899,7 @@
         <w:ind w:left="425"/>
       </w:pPr>
       <w:r>
-        <w:t>( ) Acesso a equipamentos e conexão de qualidade (provisão)</w:t>
+        <w:t>[ ] Formação continuada voltada à infância</w:t>
       </w:r>
     </w:p>
     <w:p>
@@ -2943,7 +2908,7 @@
         <w:ind w:left="425"/>
       </w:pPr>
       <w:r>
-        <w:t>( ) Aprender a usar o digital com autonomia e senso crítico (participação)</w:t>
+        <w:t>[ ] Internet instável ou ausente nas salas</w:t>
       </w:r>
     </w:p>
     <w:p>
@@ -2952,7 +2917,7 @@
         <w:ind w:left="425"/>
       </w:pPr>
       <w:r>
-        <w:t>( ) Proteção da privacidade, da imagem e dos dados (proteção)</w:t>
+        <w:t>[ ] Equipamentos insuficientes ou obsoletos</w:t>
       </w:r>
     </w:p>
     <w:p>
@@ -2961,7 +2926,54 @@
         <w:ind w:left="425"/>
       </w:pPr>
       <w:r>
-        <w:t>( ) Não sei avaliar</w:t>
+        <w:t>[ ] Pouco tempo de planejamento</w:t>
+      </w:r>
+    </w:p>
+    <w:p>
+      <w:pPr>
+        <w:spacing w:after="0"/>
+        <w:ind w:left="425"/>
+      </w:pPr>
+      <w:r>
+        <w:t>[ ] Falta de suporte técnico</w:t>
+      </w:r>
+    </w:p>
+    <w:p>
+      <w:pPr>
+        <w:spacing w:after="0"/>
+        <w:ind w:left="425"/>
+      </w:pPr>
+      <w:r>
+        <w:t>[ ] Orientações curriculares pouco claras</w:t>
+      </w:r>
+    </w:p>
+    <w:p>
+      <w:pPr>
+        <w:spacing w:after="0"/>
+        <w:ind w:left="425"/>
+      </w:pPr>
+      <w:r>
+        <w:t>[ ] Excesso de registros e exigências burocráticas</w:t>
+      </w:r>
+    </w:p>
+    <w:p>
+      <w:pPr>
+        <w:spacing w:after="0"/>
+        <w:ind w:left="425"/>
+      </w:pPr>
+      <w:r>
+        <w:t>[ ] Outro: ______________</w:t>
+      </w:r>
+    </w:p>
+    <w:p>
+      <w:pPr>
+        <w:spacing w:before="240" w:after="120"/>
+      </w:pPr>
+      <w:r>
+        <w:rPr>
+          <w:b/>
+        </w:rPr>
+        <w:t>BLOCO 6 – QUESTÃO ABERTA</w:t>
       </w:r>
     </w:p>
     <w:p>
@@ -2975,112 +2987,7 @@
         <w:t xml:space="preserve">38. </w:t>
       </w:r>
       <w:r>
-        <w:t>Quais são os principais desafios para a educação digital na sua escola? (Assinale até três)</w:t>
-      </w:r>
-    </w:p>
-    <w:p>
-      <w:pPr>
-        <w:spacing w:after="0"/>
-        <w:ind w:left="425"/>
-      </w:pPr>
-      <w:r>
-        <w:t>[ ] Formação continuada voltada à infância</w:t>
-      </w:r>
-    </w:p>
-    <w:p>
-      <w:pPr>
-        <w:spacing w:after="0"/>
-        <w:ind w:left="425"/>
-      </w:pPr>
-      <w:r>
-        <w:t>[ ] Internet instável ou ausente nas salas</w:t>
-      </w:r>
-    </w:p>
-    <w:p>
-      <w:pPr>
-        <w:spacing w:after="0"/>
-        <w:ind w:left="425"/>
-      </w:pPr>
-      <w:r>
-        <w:t>[ ] Equipamentos insuficientes ou obsoletos</w:t>
-      </w:r>
-    </w:p>
-    <w:p>
-      <w:pPr>
-        <w:spacing w:after="0"/>
-        <w:ind w:left="425"/>
-      </w:pPr>
-      <w:r>
-        <w:t>[ ] Pouco tempo de planejamento</w:t>
-      </w:r>
-    </w:p>
-    <w:p>
-      <w:pPr>
-        <w:spacing w:after="0"/>
-        <w:ind w:left="425"/>
-      </w:pPr>
-      <w:r>
-        <w:t>[ ] Falta de suporte técnico</w:t>
-      </w:r>
-    </w:p>
-    <w:p>
-      <w:pPr>
-        <w:spacing w:after="0"/>
-        <w:ind w:left="425"/>
-      </w:pPr>
-      <w:r>
-        <w:t>[ ] Orientações curriculares pouco claras</w:t>
-      </w:r>
-    </w:p>
-    <w:p>
-      <w:pPr>
-        <w:spacing w:after="0"/>
-        <w:ind w:left="425"/>
-      </w:pPr>
-      <w:r>
-        <w:t>[ ] Excesso de registros e exigências burocráticas</w:t>
-      </w:r>
-    </w:p>
-    <w:p>
-      <w:pPr>
-        <w:spacing w:after="0"/>
-        <w:ind w:left="425"/>
-      </w:pPr>
-      <w:r>
-        <w:t>[ ] Outro: ______________</w:t>
-      </w:r>
-    </w:p>
-    <w:p>
-      <w:pPr>
-        <w:spacing w:before="240" w:after="120"/>
-      </w:pPr>
-      <w:r>
-        <w:rPr>
-          <w:b/>
-        </w:rPr>
-        <w:t>BLOCO 6 – QUESTÃO ABERTA</w:t>
-      </w:r>
-    </w:p>
-    <w:p>
-      <w:pPr>
-        <w:spacing w:before="120" w:after="40"/>
-      </w:pPr>
-      <w:r>
-        <w:rPr>
-          <w:b/>
-        </w:rPr>
-        <w:t xml:space="preserve">39. </w:t>
-      </w:r>
-      <w:r>
         <w:t>Se desejar, registre comentários sobre a PNED, a realidade da escola ou as condições de trabalho com a cultura digital.</w:t>
-      </w:r>
-    </w:p>
-    <w:p>
-      <w:pPr>
-        <w:spacing w:after="0"/>
-      </w:pPr>
-      <w:r>
-        <w:t>______________________________________________________________________________</w:t>
       </w:r>
     </w:p>
     <w:p>
@@ -3108,7 +3015,7 @@
         <w:rPr>
           <w:sz w:val="22"/>
         </w:rPr>
-        <w:t>Nota metodológica: os Blocos 1 e 2 alimentam a leitura da dimensão das culturas profissionais; o Bloco 3, as dimensões material e situacional; o Bloco 4, a dimensão externa e as primeiras pistas sobre performatividade; o Bloco 5, a noção de habitar o digital e a leitura pelos direitos da criança (provisão, participação e proteção). As respostas indicam pontos a aprofundar individualmente nas entrevistas e não serão tratadas como constatação isolada.</w:t>
+        <w:t>Nota metodológica: o questionário não pergunta pelo uso de meios próprios, tema reservado à entrevista, para não antecipá-lo. Os Blocos 1 e 2 alimentam a leitura da dimensão das culturas profissionais; o Bloco 3, as dimensões material e situacional; o Bloco 4, a dimensão externa e as primeiras pistas sobre performatividade; o Bloco 5, a noção de habitar o digital e a leitura pelos direitos da criança (provisão, participação e proteção). As respostas indicam pontos a aprofundar individualmente nas entrevistas e não serão tratadas como constatação isolada.</w:t>
       </w:r>
     </w:p>
     <w:p>
@@ -3196,7 +3103,7 @@
         <w:rPr>
           <w:b/>
         </w:rPr>
-        <w:t>PARTE 1 – ROTEIRO BASE (DOCÊNCIA NOS ANOS INICIAIS)</w:t>
+        <w:t>PARTE 1 – ROTEIRO BASE (DOCÊNCIA NO 1º E NO 2º ANOS)</w:t>
       </w:r>
     </w:p>
     <w:p>

</xml_diff>

<commit_message>
Hargreaves conferido no PDF: edição Morata (2005), definição de culturas do ensino (p. 189-191)
Co-Authored-By: Claude Opus 5.5 <noreply@anthropic.com>
Claude-Session: https://claude.ai/code/session_01HxStpW4pQoDfJdTDYr6zEC
</commit_message>
<xml_diff>
--- a/projeto_reformulado/PROJETO_TESE_ENCENACAO_PNED.docx
+++ b/projeto_reformulado/PROJETO_TESE_ENCENACAO_PNED.docx
@@ -418,7 +418,7 @@
         <w:jc w:val="both"/>
       </w:pPr>
       <w:r>
-        <w:t>A dimensão das culturas profissionais compreende os valores, os compromissos e o ethos da escola como filtros que influenciam o que é acolhido, adaptado ou recusado em uma política (BALL; MAGUIRE; BRAUN, 2016). Com Hargreaves (1998), entendemos que as culturas de ensino dão sentido ao trabalho docente e funcionam como respostas coletivas às exigências que chegam à escola. Uma mesma orientação da PNED pode, assim, ganhar sentidos distintos para quem está na regência, na coordenação ou na direção. Quando uma professora afirma trabalhar cultura digital, ou uma gestora diz cuidar dos direitos digitais das crianças, cada uma fala a partir de um entendimento próprio. Hall (2006, p. 50) nos ajuda a ler essas falas ao afirmar que a cultura é “um modo de construir sentidos que influencia e organiza tanto nossas ações quanto a concepção que temos de nós mesmos”.</w:t>
+        <w:t>A dimensão das culturas profissionais compreende os valores, os compromissos e o ethos da escola como filtros que influenciam o que é acolhido, adaptado ou recusado em uma política (BALL; MAGUIRE; BRAUN, 2016). Com Hargreaves (2005, p. 189-191), entendemos as culturas de ensino como as crenças, os valores, os hábitos e as formas de fazer as coisas que comunidades de professores constroem ao enfrentar, por muitos anos, exigências e limitações semelhantes. Essas culturas dão sentido, apoio e identidade ao trabalho docente e têm também uma forma, os modos de relação entre os professores, que o autor descreve como individualismo, colaboração, colegialidade artificial e balcanização. Uma mesma orientação da PNED pode, assim, ganhar sentidos distintos para quem está na regência, na coordenação ou na direção. Quando uma professora afirma trabalhar cultura digital, ou uma gestora diz cuidar dos direitos digitais das crianças, cada uma fala a partir de um entendimento próprio. Hall (2006, p. 50) nos ajuda a ler essas falas ao afirmar que a cultura é “um modo de construir sentidos que influencia e organiza tanto nossas ações quanto a concepção que temos de nós mesmos”.</w:t>
       </w:r>
     </w:p>
     <w:p>
@@ -821,7 +821,7 @@
         <w:spacing w:line="240" w:lineRule="auto" w:after="240"/>
       </w:pPr>
       <w:r>
-        <w:t>HARGREAVES, Andy. Os professores em tempos de mudança: o trabalho e a cultura dos professores na idade pós-moderna. Lisboa: McGraw-Hill, 1998.</w:t>
+        <w:t>HARGREAVES, Andy. Profesorado, cultura y postmodernidad: cambian los tiempos, cambia el profesorado. 5. ed. Madrid: Morata, 2005.</w:t>
       </w:r>
     </w:p>
     <w:p>

</xml_diff>

<commit_message>
Recorte ampliado para os anos iniciais (1º ao 5º ano) e escuta de todos os profissionais da educação
Co-Authored-By: Claude Opus 5.5 <noreply@anthropic.com>
Claude-Session: https://claude.ai/code/session_01HxStpW4pQoDfJdTDYr6zEC
</commit_message>
<xml_diff>
--- a/projeto_reformulado/PROJETO_TESE_ENCENACAO_PNED.docx
+++ b/projeto_reformulado/PROJETO_TESE_ENCENACAO_PNED.docx
@@ -569,7 +569,7 @@
         <w:jc w:val="both"/>
       </w:pPr>
       <w:r>
-        <w:t>O lócus, entendido como contexto da prática, é a Escola Municipal Domitila Castelo, no distrito de Pipa, em Tibau do Sul (RN). Os sujeitos são profissionais da educação que atuam na instituição, abrangendo a direção, a coordenação pedagógica e as professoras das turmas de 1º e 2º anos do Ensino Fundamental, num total de onze participantes, a fim de captar a multiplicidade de interpretações e de posições na organização escolar.</w:t>
+        <w:t>O lócus, entendido como contexto da prática, é a Escola Municipal Domitila Castelo, no distrito de Pipa, em Tibau do Sul (RN). O recorte abrange os anos iniciais do Ensino Fundamental, do 1º ao 5º ano. Os sujeitos são todos os profissionais da educação que atuam nesses anos e aceitarem participar: docentes, coordenação pedagógica, direção e demais profissionais ligados ao trabalho pedagógico das turmas, como os do apoio pedagógico e do atendimento educacional especializado, quando houver. Todos constroem a política na escola, e ouvi-los permite captar a multiplicidade de interpretações e de posições na organização escolar.</w:t>
       </w:r>
     </w:p>
     <w:p>
@@ -924,7 +924,7 @@
         <w:t xml:space="preserve">Público: </w:t>
       </w:r>
       <w:r>
-        <w:t>Onze profissionais da educação da Escola Municipal Domitila Castelo, em Pipa, Tibau do Sul (RN): seis que atuam nas turmas de 1º e 2º anos do Ensino Fundamental, quatro da coordenação pedagógica e um da direção escolar.</w:t>
+        <w:t>Profissionais da educação da Escola Municipal Domitila Castelo, em Pipa, Tibau do Sul (RN), que atuam nos anos iniciais do Ensino Fundamental (1º ao 5º ano): docentes, coordenação pedagógica, direção e demais profissionais ligados ao trabalho pedagógico dessas turmas, como os do apoio pedagógico e do atendimento educacional especializado.</w:t>
       </w:r>
     </w:p>
     <w:p>
@@ -1003,7 +1003,7 @@
         <w:ind w:left="425"/>
       </w:pPr>
       <w:r>
-        <w:t>( ) Docência no 1º ou no 2º ano do Ensino Fundamental</w:t>
+        <w:t>( ) Docência do 1º ao 5º ano do Ensino Fundamental</w:t>
       </w:r>
     </w:p>
     <w:p>
@@ -1030,7 +1030,16 @@
         <w:ind w:left="425"/>
       </w:pPr>
       <w:r>
-        <w:t>( ) Outra: ______________________</w:t>
+        <w:t>( ) Apoio pedagógico ou atendimento educacional especializado</w:t>
+      </w:r>
+    </w:p>
+    <w:p>
+      <w:pPr>
+        <w:spacing w:after="0"/>
+        <w:ind w:left="425"/>
+      </w:pPr>
+      <w:r>
+        <w:t>( ) Outra função técnica ou administrativa: ______________</w:t>
       </w:r>
     </w:p>
     <w:p>
@@ -1044,7 +1053,7 @@
         <w:t xml:space="preserve">2. </w:t>
       </w:r>
       <w:r>
-        <w:t>Se atua na docência, em qual ano?</w:t>
+        <w:t>Se atua na docência, em qual(is) ano(s)?</w:t>
       </w:r>
     </w:p>
     <w:p>
@@ -1053,7 +1062,7 @@
         <w:ind w:left="425"/>
       </w:pPr>
       <w:r>
-        <w:t>( ) 1º ano</w:t>
+        <w:t>[ ] 1º ano</w:t>
       </w:r>
     </w:p>
     <w:p>
@@ -1062,7 +1071,7 @@
         <w:ind w:left="425"/>
       </w:pPr>
       <w:r>
-        <w:t>( ) 2º ano</w:t>
+        <w:t>[ ] 2º ano</w:t>
       </w:r>
     </w:p>
     <w:p>
@@ -1071,7 +1080,34 @@
         <w:ind w:left="425"/>
       </w:pPr>
       <w:r>
-        <w:t>( ) Não se aplica</w:t>
+        <w:t>[ ] 3º ano</w:t>
+      </w:r>
+    </w:p>
+    <w:p>
+      <w:pPr>
+        <w:spacing w:after="0"/>
+        <w:ind w:left="425"/>
+      </w:pPr>
+      <w:r>
+        <w:t>[ ] 4º ano</w:t>
+      </w:r>
+    </w:p>
+    <w:p>
+      <w:pPr>
+        <w:spacing w:after="0"/>
+        <w:ind w:left="425"/>
+      </w:pPr>
+      <w:r>
+        <w:t>[ ] 5º ano</w:t>
+      </w:r>
+    </w:p>
+    <w:p>
+      <w:pPr>
+        <w:spacing w:after="0"/>
+        <w:ind w:left="425"/>
+      </w:pPr>
+      <w:r>
+        <w:t>[ ] Não se aplica</w:t>
       </w:r>
     </w:p>
     <w:p>
@@ -3103,7 +3139,7 @@
         <w:rPr>
           <w:b/>
         </w:rPr>
-        <w:t>PARTE 1 – ROTEIRO BASE (DOCÊNCIA NO 1º E NO 2º ANOS)</w:t>
+        <w:t>PARTE 1 – ROTEIRO BASE (DOCÊNCIA DO 1º AO 5º ANO)</w:t>
       </w:r>
     </w:p>
     <w:p>
@@ -4070,7 +4106,149 @@
         <w:rPr>
           <w:b/>
         </w:rPr>
-        <w:t>PARTE 3 – DIRETRIZES DE APLICAÇÃO</w:t>
+        <w:t>PARTE 3 – ADAPTAÇÃO PARA OS DEMAIS PROFISSIONAIS DA EDUCAÇÃO</w:t>
+      </w:r>
+    </w:p>
+    <w:p>
+      <w:pPr>
+        <w:spacing w:after="80"/>
+        <w:jc w:val="both"/>
+      </w:pPr>
+      <w:r>
+        <w:rPr>
+          <w:sz w:val="22"/>
+        </w:rPr>
+        <w:t>Aplica-se a quem atua no apoio pedagógico, no atendimento educacional especializado ou em funções técnicas ligadas ao trabalho pedagógico dos anos iniciais. Mantêm-se os seis eixos; as perguntas abaixo partem da função de cada participante.</w:t>
+      </w:r>
+    </w:p>
+    <w:p>
+      <w:pPr>
+        <w:spacing w:after="80"/>
+        <w:ind w:left="425" w:hanging="425"/>
+        <w:jc w:val="both"/>
+      </w:pPr>
+      <w:r>
+        <w:rPr>
+          <w:b/>
+        </w:rPr>
+        <w:t>1.</w:t>
+        <w:tab/>
+      </w:r>
+      <w:r>
+        <w:t>Conte sua trajetória e descreva o que a sua função faz no dia a dia das turmas do 1º ao 5º ano.</w:t>
+      </w:r>
+    </w:p>
+    <w:p>
+      <w:pPr>
+        <w:spacing w:after="80"/>
+        <w:ind w:left="425" w:hanging="425"/>
+        <w:jc w:val="both"/>
+      </w:pPr>
+      <w:r>
+        <w:rPr>
+          <w:b/>
+        </w:rPr>
+        <w:t>2.</w:t>
+        <w:tab/>
+      </w:r>
+      <w:r>
+        <w:t>O que você conhece da PNED e da educação digital? Por quais caminhos isso chegou até você?</w:t>
+      </w:r>
+    </w:p>
+    <w:p>
+      <w:pPr>
+        <w:spacing w:after="80"/>
+        <w:ind w:left="425" w:hanging="425"/>
+        <w:jc w:val="both"/>
+      </w:pPr>
+      <w:r>
+        <w:rPr>
+          <w:b/>
+        </w:rPr>
+        <w:t>3.</w:t>
+        <w:tab/>
+      </w:r>
+      <w:r>
+        <w:t>De que modo o seu trabalho participa, ou poderia participar, das atividades de educação digital da escola?</w:t>
+      </w:r>
+    </w:p>
+    <w:p>
+      <w:pPr>
+        <w:spacing w:after="80"/>
+        <w:ind w:left="425" w:hanging="425"/>
+        <w:jc w:val="both"/>
+      </w:pPr>
+      <w:r>
+        <w:rPr>
+          <w:b/>
+        </w:rPr>
+        <w:t>4.</w:t>
+        <w:tab/>
+      </w:r>
+      <w:r>
+        <w:t>Que recursos, tempos ou apoios a sua função tem para isso, e o que falta?</w:t>
+      </w:r>
+    </w:p>
+    <w:p>
+      <w:pPr>
+        <w:spacing w:after="80"/>
+        <w:ind w:left="425" w:hanging="425"/>
+        <w:jc w:val="both"/>
+      </w:pPr>
+      <w:r>
+        <w:rPr>
+          <w:b/>
+        </w:rPr>
+        <w:t>5.</w:t>
+        <w:tab/>
+      </w:r>
+      <w:r>
+        <w:t>Você participa da produção de registros, relatórios ou evidências sobre o trabalho com as crianças? Como isso acontece?</w:t>
+      </w:r>
+    </w:p>
+    <w:p>
+      <w:pPr>
+        <w:spacing w:after="80"/>
+        <w:ind w:left="425" w:hanging="425"/>
+        <w:jc w:val="both"/>
+      </w:pPr>
+      <w:r>
+        <w:rPr>
+          <w:b/>
+        </w:rPr>
+        <w:t>6.</w:t>
+        <w:tab/>
+      </w:r>
+      <w:r>
+        <w:t>Que situações envolvendo crianças e tecnologias digitais, como uso de imagem, dados ou acesso desigual, chegam até a sua função? Como são encaminhadas?</w:t>
+      </w:r>
+    </w:p>
+    <w:p>
+      <w:pPr>
+        <w:spacing w:after="80"/>
+        <w:ind w:left="425" w:hanging="425"/>
+        <w:jc w:val="both"/>
+      </w:pPr>
+      <w:r>
+        <w:rPr>
+          <w:b/>
+        </w:rPr>
+        <w:t>7.</w:t>
+        <w:tab/>
+      </w:r>
+      <w:r>
+        <w:t>O que a escola consegue garantir às crianças que você acompanha em termos de acesso, participação e proteção no ambiente digital?</w:t>
+      </w:r>
+    </w:p>
+    <w:p>
+      <w:pPr>
+        <w:spacing w:before="240" w:after="120"/>
+      </w:pPr>
+      <w:r>
+        <w:rPr>
+          <w:b/>
+        </w:rPr>
+        <w:t>PARTE 4 – DIRETRIZES DE APLICAÇÃO</w:t>
       </w:r>
     </w:p>
     <w:p>

</xml_diff>